<commit_message>
add: JPMorganChase Data for Good hackathon (NBPA) to technical work, update resume
Hackathon card sits beside PNC; SEO and CodePath move to a row below.

Co-Authored-By: Claude Opus 5.5 <noreply@anthropic.com>
</commit_message>
<xml_diff>
--- a/Joshua Ebinisi Resume.docx
+++ b/Joshua Ebinisi Resume.docx
@@ -7,7 +7,7 @@
         <w:pBdr>
           <w:bottom w:val="single" w:sz="12" w:space="1" w:color="auto"/>
         </w:pBdr>
-        <w:spacing w:after="0" w:line="240" w:lineRule="auto"/>
+        <w:spacing w:before="40" w:after="0" w:line="240" w:lineRule="auto"/>
         <w:rPr>
           <w:rFonts w:ascii="Times New Roman" w:hAnsi="Times New Roman" w:cs="Times New Roman"/>
           <w:b/>
@@ -148,23 +148,21 @@
         </w:rPr>
         <w:tab/>
       </w:r>
-      <w:proofErr w:type="spellStart"/>
       <w:r>
         <w:rPr>
           <w:rFonts w:ascii="Times New Roman" w:hAnsi="Times New Roman" w:cs="Times New Roman"/>
           <w:sz w:val="18"/>
           <w:szCs w:val="18"/>
         </w:rPr>
-        <w:t>Houston</w:t>
-      </w:r>
-      <w:proofErr w:type="spellEnd"/>
+        <w:t xml:space="preserve">  </w:t>
+      </w:r>
       <w:r>
         <w:rPr>
           <w:rFonts w:ascii="Times New Roman" w:hAnsi="Times New Roman" w:cs="Times New Roman"/>
           <w:sz w:val="18"/>
           <w:szCs w:val="18"/>
         </w:rPr>
-        <w:t>, Texas</w:t>
+        <w:t>Houston, Texas</w:t>
       </w:r>
     </w:p>
     <w:p>
@@ -200,7 +198,16 @@
           <w:sz w:val="18"/>
           <w:szCs w:val="18"/>
         </w:rPr>
-        <w:t>Honors Progra</w:t>
+        <w:t xml:space="preserve">Honors Program </w:t>
+      </w:r>
+      <w:r>
+        <w:rPr>
+          <w:rFonts w:ascii="Times New Roman" w:eastAsia="Times New Roman" w:hAnsi="Times New Roman" w:cs="Times New Roman"/>
+          <w:color w:val="000000" w:themeColor="text1"/>
+          <w:sz w:val="18"/>
+          <w:szCs w:val="18"/>
+        </w:rPr>
+        <w:t xml:space="preserve">– </w:t>
       </w:r>
       <w:r>
         <w:rPr>
@@ -208,33 +215,17 @@
           <w:sz w:val="18"/>
           <w:szCs w:val="18"/>
         </w:rPr>
-        <w:t xml:space="preserve">m </w:t>
-      </w:r>
-      <w:r>
-        <w:rPr>
-          <w:rFonts w:ascii="Times New Roman" w:eastAsia="Times New Roman" w:hAnsi="Times New Roman" w:cs="Times New Roman"/>
-          <w:color w:val="000000" w:themeColor="text1"/>
-          <w:sz w:val="18"/>
-          <w:szCs w:val="18"/>
-        </w:rPr>
-        <w:t>–</w:t>
-      </w:r>
-      <w:r>
-        <w:rPr>
-          <w:rFonts w:ascii="Times New Roman" w:eastAsia="Times New Roman" w:hAnsi="Times New Roman" w:cs="Times New Roman"/>
-          <w:color w:val="000000" w:themeColor="text1"/>
-          <w:sz w:val="18"/>
-          <w:szCs w:val="18"/>
-        </w:rPr>
-        <w:t xml:space="preserve"> </w:t>
+        <w:t xml:space="preserve">GPA: </w:t>
       </w:r>
       <w:r>
         <w:rPr>
           <w:rFonts w:ascii="Times New Roman" w:hAnsi="Times New Roman" w:cs="Times New Roman"/>
-          <w:sz w:val="18"/>
-          <w:szCs w:val="18"/>
-        </w:rPr>
-        <w:t>G</w:t>
+          <w:b/>
+          <w:bCs/>
+          <w:sz w:val="18"/>
+          <w:szCs w:val="18"/>
+        </w:rPr>
+        <w:t>3.73</w:t>
       </w:r>
       <w:r>
         <w:rPr>
@@ -242,17 +233,15 @@
           <w:sz w:val="18"/>
           <w:szCs w:val="18"/>
         </w:rPr>
-        <w:t xml:space="preserve">PA: </w:t>
+        <w:tab/>
       </w:r>
       <w:r>
         <w:rPr>
           <w:rFonts w:ascii="Times New Roman" w:hAnsi="Times New Roman" w:cs="Times New Roman"/>
-          <w:b/>
-          <w:bCs/>
-          <w:sz w:val="18"/>
-          <w:szCs w:val="18"/>
-        </w:rPr>
-        <w:t>3.73</w:t>
+          <w:sz w:val="18"/>
+          <w:szCs w:val="18"/>
+        </w:rPr>
+        <w:tab/>
       </w:r>
       <w:r>
         <w:rPr>
@@ -300,7 +289,7 @@
           <w:sz w:val="18"/>
           <w:szCs w:val="18"/>
         </w:rPr>
-        <w:tab/>
+        <w:t xml:space="preserve">  </w:t>
       </w:r>
       <w:r>
         <w:rPr>
@@ -308,7 +297,6 @@
           <w:sz w:val="18"/>
           <w:szCs w:val="18"/>
         </w:rPr>
-        <w:tab/>
         <w:t xml:space="preserve">         May</w:t>
       </w:r>
       <w:r>
@@ -346,90 +334,33 @@
           <w:sz w:val="18"/>
           <w:szCs w:val="18"/>
         </w:rPr>
-        <w:t xml:space="preserve">: </w:t>
+        <w:t xml:space="preserve">: Programming Fundamentals II, Physics, </w:t>
       </w:r>
       <w:r>
         <w:rPr>
           <w:rFonts w:ascii="Times New Roman" w:hAnsi="Times New Roman" w:cs="Times New Roman"/>
-          <w:bCs/>
-          <w:sz w:val="18"/>
-          <w:szCs w:val="18"/>
-        </w:rPr>
-        <w:t xml:space="preserve">Programming Fundamentals II, Physics, </w:t>
-      </w:r>
+          <w:sz w:val="18"/>
+          <w:szCs w:val="18"/>
+        </w:rPr>
+        <w:t xml:space="preserve">Computing for Engineers, </w:t>
+      </w:r>
+      <w:bookmarkStart w:id="0" w:name="_Hlk210250864"/>
       <w:r>
         <w:rPr>
           <w:rFonts w:ascii="Times New Roman" w:hAnsi="Times New Roman" w:cs="Times New Roman"/>
           <w:sz w:val="18"/>
           <w:szCs w:val="18"/>
         </w:rPr>
-        <w:t>Computing for</w:t>
-      </w:r>
+        <w:t xml:space="preserve">Calculus </w:t>
+      </w:r>
+      <w:bookmarkEnd w:id="0"/>
       <w:r>
         <w:rPr>
           <w:rFonts w:ascii="Times New Roman" w:hAnsi="Times New Roman" w:cs="Times New Roman"/>
           <w:sz w:val="18"/>
           <w:szCs w:val="18"/>
         </w:rPr>
-        <w:t xml:space="preserve"> Engineer</w:t>
-      </w:r>
-      <w:r>
-        <w:rPr>
-          <w:rFonts w:ascii="Times New Roman" w:hAnsi="Times New Roman" w:cs="Times New Roman"/>
-          <w:sz w:val="18"/>
-          <w:szCs w:val="18"/>
-        </w:rPr>
-        <w:t>s</w:t>
-      </w:r>
-      <w:r>
-        <w:rPr>
-          <w:rFonts w:ascii="Times New Roman" w:hAnsi="Times New Roman" w:cs="Times New Roman"/>
-          <w:sz w:val="18"/>
-          <w:szCs w:val="18"/>
-        </w:rPr>
-        <w:t>,</w:t>
-      </w:r>
-      <w:r>
-        <w:rPr>
-          <w:rFonts w:ascii="Times New Roman" w:hAnsi="Times New Roman" w:cs="Times New Roman"/>
-          <w:sz w:val="18"/>
-          <w:szCs w:val="18"/>
-        </w:rPr>
-        <w:t xml:space="preserve"> </w:t>
-      </w:r>
-      <w:bookmarkStart w:id="0" w:name="_Hlk210250864"/>
-      <w:r>
-        <w:rPr>
-          <w:rFonts w:ascii="Times New Roman" w:hAnsi="Times New Roman" w:cs="Times New Roman"/>
-          <w:sz w:val="18"/>
-          <w:szCs w:val="18"/>
-        </w:rPr>
-        <w:t xml:space="preserve">Calculus </w:t>
-      </w:r>
-      <w:bookmarkEnd w:id="0"/>
-      <w:r>
-        <w:rPr>
-          <w:rFonts w:ascii="Times New Roman" w:hAnsi="Times New Roman" w:cs="Times New Roman"/>
-          <w:sz w:val="18"/>
-          <w:szCs w:val="18"/>
-        </w:rPr>
-        <w:t>I &amp; II</w:t>
-      </w:r>
-      <w:r>
-        <w:rPr>
-          <w:rFonts w:ascii="Times New Roman" w:hAnsi="Times New Roman" w:cs="Times New Roman"/>
-          <w:sz w:val="18"/>
-          <w:szCs w:val="18"/>
-        </w:rPr>
-        <w:t>, Macroeconomics</w:t>
-      </w:r>
-      <w:r>
-        <w:rPr>
-          <w:rFonts w:ascii="Times New Roman" w:hAnsi="Times New Roman" w:cs="Times New Roman"/>
-          <w:sz w:val="18"/>
-          <w:szCs w:val="18"/>
-        </w:rPr>
-        <w:t>, AI/ML Concepts</w:t>
+        <w:t>I &amp; II, Macroeconomics, AI/ML Concepts</w:t>
       </w:r>
     </w:p>
     <w:p>
@@ -460,33 +391,7 @@
           <w:sz w:val="18"/>
           <w:szCs w:val="18"/>
         </w:rPr>
-        <w:t>NSBE</w:t>
-      </w:r>
-      <w:r>
-        <w:rPr>
-          <w:rFonts w:ascii="Times New Roman" w:hAnsi="Times New Roman" w:cs="Times New Roman"/>
-          <w:sz w:val="18"/>
-          <w:szCs w:val="18"/>
-        </w:rPr>
-        <w:t xml:space="preserve">, SEO Career, </w:t>
-      </w:r>
-      <w:proofErr w:type="spellStart"/>
-      <w:r>
-        <w:rPr>
-          <w:rFonts w:ascii="Times New Roman" w:hAnsi="Times New Roman" w:cs="Times New Roman"/>
-          <w:sz w:val="18"/>
-          <w:szCs w:val="18"/>
-        </w:rPr>
-        <w:t>Codepath</w:t>
-      </w:r>
-      <w:proofErr w:type="spellEnd"/>
-      <w:r>
-        <w:rPr>
-          <w:rFonts w:ascii="Times New Roman" w:hAnsi="Times New Roman" w:cs="Times New Roman"/>
-          <w:sz w:val="18"/>
-          <w:szCs w:val="18"/>
-        </w:rPr>
-        <w:t>, IEEE</w:t>
+        <w:t>NSBE, SEO Career, Codepath, IEEE</w:t>
       </w:r>
     </w:p>
     <w:p>
@@ -517,7 +422,16 @@
           <w:sz w:val="18"/>
           <w:szCs w:val="18"/>
         </w:rPr>
-        <w:t>:</w:t>
+        <w:t xml:space="preserve">: Dean’s List, Academic Excellence Scholarship, </w:t>
+      </w:r>
+      <w:r>
+        <w:rPr>
+          <w:rFonts w:ascii="Times New Roman" w:eastAsia="Times New Roman" w:hAnsi="Times New Roman" w:cs="Times New Roman"/>
+          <w:color w:val="000000" w:themeColor="text1"/>
+          <w:sz w:val="18"/>
+          <w:szCs w:val="18"/>
+        </w:rPr>
+        <w:t xml:space="preserve">Georgia CCE Honor Society, </w:t>
       </w:r>
       <w:r>
         <w:rPr>
@@ -525,112 +439,16 @@
           <w:sz w:val="18"/>
           <w:szCs w:val="18"/>
         </w:rPr>
-        <w:t xml:space="preserve"> </w:t>
-      </w:r>
-      <w:r>
-        <w:rPr>
-          <w:rFonts w:ascii="Times New Roman" w:hAnsi="Times New Roman" w:cs="Times New Roman"/>
-          <w:sz w:val="18"/>
-          <w:szCs w:val="18"/>
-        </w:rPr>
-        <w:t xml:space="preserve">Dean’s List, Academic Excellence Scholarship, </w:t>
-      </w:r>
-      <w:r>
-        <w:rPr>
-          <w:rFonts w:ascii="Times New Roman" w:eastAsia="Times New Roman" w:hAnsi="Times New Roman" w:cs="Times New Roman"/>
-          <w:color w:val="000000" w:themeColor="text1"/>
-          <w:sz w:val="18"/>
-          <w:szCs w:val="18"/>
-        </w:rPr>
-        <w:t xml:space="preserve">Georgia </w:t>
-      </w:r>
-      <w:r>
-        <w:rPr>
-          <w:rFonts w:ascii="Times New Roman" w:eastAsia="Times New Roman" w:hAnsi="Times New Roman" w:cs="Times New Roman"/>
-          <w:color w:val="000000" w:themeColor="text1"/>
-          <w:sz w:val="18"/>
-          <w:szCs w:val="18"/>
-        </w:rPr>
-        <w:t>CCE</w:t>
-      </w:r>
-      <w:r>
-        <w:rPr>
-          <w:rFonts w:ascii="Times New Roman" w:eastAsia="Times New Roman" w:hAnsi="Times New Roman" w:cs="Times New Roman"/>
-          <w:color w:val="000000" w:themeColor="text1"/>
-          <w:sz w:val="18"/>
-          <w:szCs w:val="18"/>
-        </w:rPr>
-        <w:t xml:space="preserve"> Honor Society, </w:t>
-      </w:r>
-      <w:r>
-        <w:rPr>
-          <w:rFonts w:ascii="Times New Roman" w:hAnsi="Times New Roman" w:cs="Times New Roman"/>
-          <w:sz w:val="18"/>
-          <w:szCs w:val="18"/>
-        </w:rPr>
-        <w:t>GGC</w:t>
-      </w:r>
-      <w:r>
-        <w:rPr>
-          <w:rFonts w:ascii="Times New Roman" w:hAnsi="Times New Roman" w:cs="Times New Roman"/>
-          <w:sz w:val="18"/>
-          <w:szCs w:val="18"/>
-        </w:rPr>
-        <w:t xml:space="preserve"> President’s List, </w:t>
-      </w:r>
-      <w:r>
-        <w:rPr>
-          <w:rFonts w:ascii="Times New Roman" w:eastAsia="Times New Roman" w:hAnsi="Times New Roman" w:cs="Times New Roman"/>
-          <w:color w:val="000000" w:themeColor="text1"/>
-          <w:sz w:val="18"/>
-          <w:szCs w:val="18"/>
-        </w:rPr>
-        <w:t>DoE</w:t>
-      </w:r>
-      <w:r>
-        <w:rPr>
-          <w:rFonts w:ascii="Times New Roman" w:eastAsia="Times New Roman" w:hAnsi="Times New Roman" w:cs="Times New Roman"/>
-          <w:color w:val="000000" w:themeColor="text1"/>
-          <w:sz w:val="18"/>
-          <w:szCs w:val="18"/>
-        </w:rPr>
-        <w:t xml:space="preserve"> </w:t>
-      </w:r>
-      <w:r>
-        <w:rPr>
-          <w:rFonts w:ascii="Times New Roman" w:eastAsia="Times New Roman" w:hAnsi="Times New Roman" w:cs="Times New Roman"/>
-          <w:color w:val="000000" w:themeColor="text1"/>
-          <w:sz w:val="18"/>
-          <w:szCs w:val="18"/>
-        </w:rPr>
-        <w:t>Intl.</w:t>
-      </w:r>
-      <w:r>
-        <w:rPr>
-          <w:rFonts w:ascii="Times New Roman" w:eastAsia="Times New Roman" w:hAnsi="Times New Roman" w:cs="Times New Roman"/>
-          <w:color w:val="000000" w:themeColor="text1"/>
-          <w:sz w:val="18"/>
-          <w:szCs w:val="18"/>
-        </w:rPr>
-        <w:t xml:space="preserve"> Award, Harvard </w:t>
-      </w:r>
-      <w:r>
-        <w:rPr>
-          <w:rFonts w:ascii="Times New Roman" w:eastAsia="Times New Roman" w:hAnsi="Times New Roman" w:cs="Times New Roman"/>
-          <w:color w:val="000000" w:themeColor="text1"/>
-          <w:sz w:val="18"/>
-          <w:szCs w:val="18"/>
-        </w:rPr>
-        <w:t>YL</w:t>
-      </w:r>
-      <w:r>
-        <w:rPr>
-          <w:rFonts w:ascii="Times New Roman" w:eastAsia="Times New Roman" w:hAnsi="Times New Roman" w:cs="Times New Roman"/>
-          <w:color w:val="000000" w:themeColor="text1"/>
-          <w:sz w:val="18"/>
-          <w:szCs w:val="18"/>
-        </w:rPr>
-        <w:t xml:space="preserve"> Program</w:t>
+        <w:t xml:space="preserve">GGC President’s List, </w:t>
+      </w:r>
+      <w:r>
+        <w:rPr>
+          <w:rFonts w:ascii="Times New Roman" w:eastAsia="Times New Roman" w:hAnsi="Times New Roman" w:cs="Times New Roman"/>
+          <w:color w:val="000000" w:themeColor="text1"/>
+          <w:sz w:val="18"/>
+          <w:szCs w:val="18"/>
+        </w:rPr>
+        <w:t>DoE Intl. Award, Harvard YL Program</w:t>
       </w:r>
     </w:p>
     <w:p>
@@ -653,16 +471,7 @@
           <w:sz w:val="18"/>
           <w:szCs w:val="18"/>
         </w:rPr>
-        <w:t xml:space="preserve">TECHNICAL </w:t>
-      </w:r>
-      <w:r>
-        <w:rPr>
-          <w:rFonts w:ascii="Times New Roman" w:hAnsi="Times New Roman" w:cs="Times New Roman"/>
-          <w:b/>
-          <w:sz w:val="18"/>
-          <w:szCs w:val="18"/>
-        </w:rPr>
-        <w:t>SKILLS</w:t>
+        <w:t>TECHNICAL SKILLS</w:t>
       </w:r>
     </w:p>
     <w:p>
@@ -690,23 +499,7 @@
           <w:sz w:val="18"/>
           <w:szCs w:val="18"/>
         </w:rPr>
-        <w:t>Python, C++, JavaScript, SQL</w:t>
-      </w:r>
-      <w:r>
-        <w:rPr>
-          <w:rFonts w:ascii="Times New Roman" w:hAnsi="Times New Roman" w:cs="Times New Roman"/>
-          <w:sz w:val="18"/>
-          <w:szCs w:val="18"/>
-        </w:rPr>
-        <w:t xml:space="preserve">, Bash, PowerShell, </w:t>
-      </w:r>
-      <w:r>
-        <w:rPr>
-          <w:rFonts w:ascii="Times New Roman" w:hAnsi="Times New Roman" w:cs="Times New Roman"/>
-          <w:sz w:val="18"/>
-          <w:szCs w:val="18"/>
-        </w:rPr>
-        <w:t>HTML/CSS</w:t>
+        <w:t>Python, C++, JavaScript, SQL, Bash, PowerShell, HTML/CSS</w:t>
       </w:r>
     </w:p>
     <w:p>
@@ -728,67 +521,13 @@
         </w:rPr>
         <w:t xml:space="preserve">Frameworks/Libraries: </w:t>
       </w:r>
-      <w:proofErr w:type="spellStart"/>
       <w:r>
         <w:rPr>
           <w:rFonts w:ascii="Times New Roman" w:hAnsi="Times New Roman" w:cs="Times New Roman"/>
           <w:sz w:val="18"/>
           <w:szCs w:val="18"/>
         </w:rPr>
-        <w:t>PySpark</w:t>
-      </w:r>
-      <w:proofErr w:type="spellEnd"/>
-      <w:r>
-        <w:rPr>
-          <w:rFonts w:ascii="Times New Roman" w:hAnsi="Times New Roman" w:cs="Times New Roman"/>
-          <w:sz w:val="18"/>
-          <w:szCs w:val="18"/>
-        </w:rPr>
-        <w:t xml:space="preserve">, </w:t>
-      </w:r>
-      <w:proofErr w:type="spellStart"/>
-      <w:r>
-        <w:rPr>
-          <w:rFonts w:ascii="Times New Roman" w:hAnsi="Times New Roman" w:cs="Times New Roman"/>
-          <w:sz w:val="18"/>
-          <w:szCs w:val="18"/>
-        </w:rPr>
-        <w:t>PyTorch</w:t>
-      </w:r>
-      <w:proofErr w:type="spellEnd"/>
-      <w:r>
-        <w:rPr>
-          <w:rFonts w:ascii="Times New Roman" w:hAnsi="Times New Roman" w:cs="Times New Roman"/>
-          <w:sz w:val="18"/>
-          <w:szCs w:val="18"/>
-        </w:rPr>
-        <w:t xml:space="preserve">, Pandas, NumPy, Seaborn, Matplotlib, </w:t>
-      </w:r>
-      <w:proofErr w:type="spellStart"/>
-      <w:r>
-        <w:rPr>
-          <w:rFonts w:ascii="Times New Roman" w:hAnsi="Times New Roman" w:cs="Times New Roman"/>
-          <w:sz w:val="18"/>
-          <w:szCs w:val="18"/>
-        </w:rPr>
-        <w:t>Streamlit</w:t>
-      </w:r>
-      <w:proofErr w:type="spellEnd"/>
-      <w:r>
-        <w:rPr>
-          <w:rFonts w:ascii="Times New Roman" w:hAnsi="Times New Roman" w:cs="Times New Roman"/>
-          <w:sz w:val="18"/>
-          <w:szCs w:val="18"/>
-        </w:rPr>
-        <w:t xml:space="preserve">, React, Node.js, </w:t>
-      </w:r>
-      <w:r>
-        <w:rPr>
-          <w:rFonts w:ascii="Times New Roman" w:hAnsi="Times New Roman" w:cs="Times New Roman"/>
-          <w:sz w:val="18"/>
-          <w:szCs w:val="18"/>
-        </w:rPr>
-        <w:t>Pickle, Scikit-learn, yFinance, MySQL</w:t>
+        <w:t>PySpark, PyTorch, Pandas, NumPy, Seaborn, Matplotlib, Streamlit, React, Node.js, Pickle, Scikit-learn, yFinance, MySQL</w:t>
       </w:r>
     </w:p>
     <w:p>
@@ -828,157 +567,16 @@
           <w:szCs w:val="18"/>
         </w:rPr>
         <w:br/>
-        <w:t>Tools/Platforms</w:t>
-      </w:r>
-      <w:r>
-        <w:rPr>
-          <w:rFonts w:ascii="Times New Roman" w:hAnsi="Times New Roman" w:cs="Times New Roman"/>
-          <w:b/>
-          <w:bCs/>
-          <w:sz w:val="18"/>
-          <w:szCs w:val="18"/>
-        </w:rPr>
-        <w:t>:</w:t>
-      </w:r>
-      <w:r>
-        <w:rPr>
-          <w:rFonts w:ascii="Times New Roman" w:hAnsi="Times New Roman" w:cs="Times New Roman"/>
-          <w:b/>
-          <w:bCs/>
-          <w:sz w:val="18"/>
-          <w:szCs w:val="18"/>
-        </w:rPr>
-        <w:t xml:space="preserve"> </w:t>
-      </w:r>
-      <w:r>
-        <w:rPr>
-          <w:rFonts w:ascii="Times New Roman" w:eastAsia="Times New Roman" w:hAnsi="Times New Roman" w:cs="Times New Roman"/>
-          <w:color w:val="000000" w:themeColor="text1"/>
-          <w:sz w:val="18"/>
-          <w:szCs w:val="18"/>
-        </w:rPr>
-        <w:t xml:space="preserve">Jupyter Notebook, VS Code, </w:t>
-      </w:r>
-      <w:r>
-        <w:rPr>
-          <w:rFonts w:ascii="Times New Roman" w:eastAsia="Times New Roman" w:hAnsi="Times New Roman" w:cs="Times New Roman"/>
-          <w:color w:val="000000" w:themeColor="text1"/>
-          <w:sz w:val="18"/>
-          <w:szCs w:val="18"/>
-        </w:rPr>
-        <w:t>Obsidian</w:t>
-      </w:r>
-      <w:r>
-        <w:rPr>
-          <w:rFonts w:ascii="Times New Roman" w:eastAsia="Times New Roman" w:hAnsi="Times New Roman" w:cs="Times New Roman"/>
-          <w:color w:val="000000" w:themeColor="text1"/>
-          <w:sz w:val="18"/>
-          <w:szCs w:val="18"/>
-        </w:rPr>
-        <w:t xml:space="preserve">, Git, </w:t>
-      </w:r>
-      <w:proofErr w:type="spellStart"/>
-      <w:r>
-        <w:rPr>
-          <w:rFonts w:ascii="Times New Roman" w:eastAsia="Times New Roman" w:hAnsi="Times New Roman" w:cs="Times New Roman"/>
-          <w:color w:val="000000" w:themeColor="text1"/>
-          <w:sz w:val="18"/>
-          <w:szCs w:val="18"/>
-        </w:rPr>
-        <w:t>TradingView</w:t>
-      </w:r>
-      <w:proofErr w:type="spellEnd"/>
-      <w:r>
-        <w:rPr>
-          <w:rFonts w:ascii="Times New Roman" w:eastAsia="Times New Roman" w:hAnsi="Times New Roman" w:cs="Times New Roman"/>
-          <w:color w:val="000000" w:themeColor="text1"/>
-          <w:sz w:val="18"/>
-          <w:szCs w:val="18"/>
-        </w:rPr>
-        <w:t xml:space="preserve">, </w:t>
-      </w:r>
-      <w:proofErr w:type="spellStart"/>
-      <w:r>
-        <w:rPr>
-          <w:rFonts w:ascii="Times New Roman" w:eastAsia="Times New Roman" w:hAnsi="Times New Roman" w:cs="Times New Roman"/>
-          <w:color w:val="000000" w:themeColor="text1"/>
-          <w:sz w:val="18"/>
-          <w:szCs w:val="18"/>
-        </w:rPr>
-        <w:t>Slurm</w:t>
-      </w:r>
-      <w:proofErr w:type="spellEnd"/>
-      <w:r>
-        <w:rPr>
-          <w:rFonts w:ascii="Times New Roman" w:eastAsia="Times New Roman" w:hAnsi="Times New Roman" w:cs="Times New Roman"/>
-          <w:color w:val="000000" w:themeColor="text1"/>
-          <w:sz w:val="18"/>
-          <w:szCs w:val="18"/>
-        </w:rPr>
-        <w:t xml:space="preserve">, Bitbucket, Azure DevOps, </w:t>
-      </w:r>
-      <w:r>
-        <w:rPr>
-          <w:rFonts w:ascii="Times New Roman" w:eastAsia="Times New Roman" w:hAnsi="Times New Roman" w:cs="Times New Roman"/>
-          <w:color w:val="000000" w:themeColor="text1"/>
-          <w:sz w:val="18"/>
-          <w:szCs w:val="18"/>
-        </w:rPr>
-        <w:t xml:space="preserve">Microsoft Office Suites, </w:t>
-      </w:r>
-      <w:r>
-        <w:rPr>
-          <w:rFonts w:ascii="Times New Roman" w:eastAsia="Times New Roman" w:hAnsi="Times New Roman" w:cs="Times New Roman"/>
-          <w:color w:val="000000" w:themeColor="text1"/>
-          <w:sz w:val="18"/>
-          <w:szCs w:val="18"/>
-        </w:rPr>
-        <w:t>MSAL</w:t>
-      </w:r>
-      <w:r>
-        <w:rPr>
-          <w:rFonts w:ascii="Times New Roman" w:eastAsia="Times New Roman" w:hAnsi="Times New Roman" w:cs="Times New Roman"/>
-          <w:color w:val="000000" w:themeColor="text1"/>
-          <w:sz w:val="18"/>
-          <w:szCs w:val="18"/>
-        </w:rPr>
-        <w:t>,</w:t>
-      </w:r>
-      <w:r>
-        <w:rPr>
-          <w:rFonts w:ascii="Times New Roman" w:eastAsia="Times New Roman" w:hAnsi="Times New Roman" w:cs="Times New Roman"/>
-          <w:color w:val="000000" w:themeColor="text1"/>
-          <w:sz w:val="18"/>
-          <w:szCs w:val="18"/>
-        </w:rPr>
-        <w:t xml:space="preserve"> Alation,</w:t>
-      </w:r>
-      <w:r>
-        <w:rPr>
-          <w:rFonts w:ascii="Times New Roman" w:eastAsia="Times New Roman" w:hAnsi="Times New Roman" w:cs="Times New Roman"/>
-          <w:color w:val="000000" w:themeColor="text1"/>
-          <w:sz w:val="18"/>
-          <w:szCs w:val="18"/>
-        </w:rPr>
-        <w:t xml:space="preserve"> MATLAB, </w:t>
-      </w:r>
-      <w:r>
-        <w:rPr>
-          <w:rFonts w:ascii="Times New Roman" w:eastAsia="Times New Roman" w:hAnsi="Times New Roman" w:cs="Times New Roman"/>
-          <w:color w:val="000000" w:themeColor="text1"/>
-          <w:sz w:val="18"/>
-          <w:szCs w:val="18"/>
-        </w:rPr>
-        <w:t>Arduino</w:t>
-      </w:r>
-      <w:r>
-        <w:rPr>
-          <w:rFonts w:ascii="Times New Roman" w:eastAsia="Times New Roman" w:hAnsi="Times New Roman" w:cs="Times New Roman"/>
-          <w:color w:val="000000" w:themeColor="text1"/>
-          <w:sz w:val="18"/>
-          <w:szCs w:val="18"/>
-        </w:rPr>
-        <w:t>, Tinker CAD, Unity</w:t>
+        <w:t xml:space="preserve">Tools/Platforms: </w:t>
+      </w:r>
+      <w:r>
+        <w:rPr>
+          <w:rFonts w:ascii="Times New Roman" w:eastAsia="Times New Roman" w:hAnsi="Times New Roman" w:cs="Times New Roman"/>
+          <w:color w:val="000000" w:themeColor="text1"/>
+          <w:sz w:val="18"/>
+          <w:szCs w:val="18"/>
+        </w:rPr>
+        <w:t>Jupyter Notebook, VS Code, Obsidian, Git, TradingView, Slurm, Bitbucket, Azure DevOps, Microsoft Office Suites, MSAL, Alation, MATLAB, Arduino, Tinker CAD, Unity</w:t>
       </w:r>
     </w:p>
     <w:p>
@@ -1024,216 +622,158 @@
           <w:sz w:val="18"/>
           <w:szCs w:val="18"/>
         </w:rPr>
-        <w:t>PNC</w:t>
-      </w:r>
-      <w:r>
-        <w:rPr>
-          <w:rFonts w:ascii="Times New Roman" w:eastAsia="Times New Roman" w:hAnsi="Times New Roman" w:cs="Times New Roman"/>
-          <w:b/>
-          <w:bCs/>
-          <w:color w:val="000000" w:themeColor="text1"/>
-          <w:sz w:val="18"/>
-          <w:szCs w:val="18"/>
-        </w:rPr>
-        <w:tab/>
-      </w:r>
-      <w:r>
-        <w:rPr>
-          <w:rFonts w:ascii="Times New Roman" w:eastAsia="Times New Roman" w:hAnsi="Times New Roman" w:cs="Times New Roman"/>
-          <w:b/>
-          <w:bCs/>
-          <w:color w:val="000000" w:themeColor="text1"/>
-          <w:sz w:val="18"/>
-          <w:szCs w:val="18"/>
-        </w:rPr>
-        <w:tab/>
-      </w:r>
-      <w:r>
-        <w:rPr>
-          <w:rFonts w:ascii="Times New Roman" w:eastAsia="Times New Roman" w:hAnsi="Times New Roman" w:cs="Times New Roman"/>
-          <w:b/>
-          <w:bCs/>
-          <w:color w:val="000000" w:themeColor="text1"/>
-          <w:sz w:val="18"/>
-          <w:szCs w:val="18"/>
-        </w:rPr>
-        <w:tab/>
-      </w:r>
-      <w:r>
-        <w:rPr>
-          <w:rFonts w:ascii="Times New Roman" w:eastAsia="Times New Roman" w:hAnsi="Times New Roman" w:cs="Times New Roman"/>
-          <w:b/>
-          <w:bCs/>
-          <w:color w:val="000000" w:themeColor="text1"/>
-          <w:sz w:val="18"/>
-          <w:szCs w:val="18"/>
-        </w:rPr>
-        <w:tab/>
-      </w:r>
-      <w:r>
-        <w:rPr>
-          <w:rFonts w:ascii="Times New Roman" w:eastAsia="Times New Roman" w:hAnsi="Times New Roman" w:cs="Times New Roman"/>
-          <w:b/>
-          <w:bCs/>
-          <w:color w:val="000000" w:themeColor="text1"/>
-          <w:sz w:val="18"/>
-          <w:szCs w:val="18"/>
-        </w:rPr>
-        <w:tab/>
-      </w:r>
-      <w:r>
-        <w:rPr>
-          <w:rFonts w:ascii="Times New Roman" w:eastAsia="Times New Roman" w:hAnsi="Times New Roman" w:cs="Times New Roman"/>
-          <w:b/>
-          <w:bCs/>
-          <w:color w:val="000000" w:themeColor="text1"/>
-          <w:sz w:val="18"/>
-          <w:szCs w:val="18"/>
-        </w:rPr>
-        <w:tab/>
-      </w:r>
-      <w:r>
-        <w:rPr>
-          <w:rFonts w:ascii="Times New Roman" w:eastAsia="Times New Roman" w:hAnsi="Times New Roman" w:cs="Times New Roman"/>
-          <w:b/>
-          <w:bCs/>
-          <w:color w:val="000000" w:themeColor="text1"/>
-          <w:sz w:val="18"/>
-          <w:szCs w:val="18"/>
-        </w:rPr>
-        <w:tab/>
-      </w:r>
-      <w:r>
-        <w:rPr>
-          <w:rFonts w:ascii="Times New Roman" w:eastAsia="Times New Roman" w:hAnsi="Times New Roman" w:cs="Times New Roman"/>
-          <w:b/>
-          <w:bCs/>
-          <w:color w:val="000000" w:themeColor="text1"/>
-          <w:sz w:val="18"/>
-          <w:szCs w:val="18"/>
-        </w:rPr>
-        <w:tab/>
-      </w:r>
-      <w:r>
-        <w:rPr>
-          <w:rFonts w:ascii="Times New Roman" w:eastAsia="Times New Roman" w:hAnsi="Times New Roman" w:cs="Times New Roman"/>
-          <w:b/>
-          <w:bCs/>
-          <w:color w:val="000000" w:themeColor="text1"/>
-          <w:sz w:val="18"/>
-          <w:szCs w:val="18"/>
-        </w:rPr>
-        <w:tab/>
-      </w:r>
-      <w:r>
-        <w:rPr>
-          <w:rFonts w:ascii="Times New Roman" w:eastAsia="Times New Roman" w:hAnsi="Times New Roman" w:cs="Times New Roman"/>
-          <w:b/>
-          <w:bCs/>
-          <w:color w:val="000000" w:themeColor="text1"/>
-          <w:sz w:val="18"/>
-          <w:szCs w:val="18"/>
-        </w:rPr>
-        <w:tab/>
-      </w:r>
-      <w:r>
-        <w:rPr>
-          <w:rFonts w:ascii="Times New Roman" w:eastAsia="Times New Roman" w:hAnsi="Times New Roman" w:cs="Times New Roman"/>
-          <w:b/>
-          <w:bCs/>
-          <w:color w:val="000000" w:themeColor="text1"/>
-          <w:sz w:val="18"/>
-          <w:szCs w:val="18"/>
-        </w:rPr>
-        <w:tab/>
-      </w:r>
-      <w:r>
-        <w:rPr>
-          <w:rFonts w:ascii="Times New Roman" w:eastAsia="Times New Roman" w:hAnsi="Times New Roman" w:cs="Times New Roman"/>
-          <w:b/>
-          <w:bCs/>
-          <w:color w:val="000000" w:themeColor="text1"/>
-          <w:sz w:val="18"/>
-          <w:szCs w:val="18"/>
-        </w:rPr>
-        <w:tab/>
-      </w:r>
-      <w:r>
-        <w:rPr>
-          <w:rFonts w:ascii="Times New Roman" w:eastAsia="Times New Roman" w:hAnsi="Times New Roman" w:cs="Times New Roman"/>
-          <w:b/>
-          <w:bCs/>
-          <w:color w:val="000000" w:themeColor="text1"/>
-          <w:sz w:val="18"/>
-          <w:szCs w:val="18"/>
-        </w:rPr>
-        <w:tab/>
-        <w:t xml:space="preserve">   </w:t>
-      </w:r>
-      <w:r>
-        <w:rPr>
-          <w:rFonts w:ascii="Times New Roman" w:eastAsia="Times New Roman" w:hAnsi="Times New Roman" w:cs="Times New Roman"/>
-          <w:b/>
-          <w:bCs/>
-          <w:color w:val="000000" w:themeColor="text1"/>
-          <w:sz w:val="18"/>
-          <w:szCs w:val="18"/>
-        </w:rPr>
-        <w:tab/>
-      </w:r>
-      <w:r>
-        <w:rPr>
-          <w:rFonts w:ascii="Times New Roman" w:eastAsia="Times New Roman" w:hAnsi="Times New Roman" w:cs="Times New Roman"/>
-          <w:color w:val="000000" w:themeColor="text1"/>
-          <w:sz w:val="18"/>
-          <w:szCs w:val="18"/>
-        </w:rPr>
-        <w:t>Washington</w:t>
-      </w:r>
-      <w:r>
-        <w:rPr>
-          <w:rFonts w:ascii="Times New Roman" w:eastAsia="Times New Roman" w:hAnsi="Times New Roman" w:cs="Times New Roman"/>
-          <w:color w:val="000000" w:themeColor="text1"/>
-          <w:sz w:val="18"/>
-          <w:szCs w:val="18"/>
-        </w:rPr>
-        <w:t xml:space="preserve"> </w:t>
-      </w:r>
-      <w:r>
-        <w:rPr>
-          <w:rFonts w:ascii="Times New Roman" w:eastAsia="Times New Roman" w:hAnsi="Times New Roman" w:cs="Times New Roman"/>
-          <w:color w:val="000000" w:themeColor="text1"/>
-          <w:sz w:val="18"/>
-          <w:szCs w:val="18"/>
-        </w:rPr>
-        <w:t>D</w:t>
-      </w:r>
-      <w:r>
-        <w:rPr>
-          <w:rFonts w:ascii="Times New Roman" w:eastAsia="Times New Roman" w:hAnsi="Times New Roman" w:cs="Times New Roman"/>
-          <w:color w:val="000000" w:themeColor="text1"/>
-          <w:sz w:val="18"/>
-          <w:szCs w:val="18"/>
-        </w:rPr>
-        <w:t>.</w:t>
-      </w:r>
-      <w:r>
-        <w:rPr>
-          <w:rFonts w:ascii="Times New Roman" w:eastAsia="Times New Roman" w:hAnsi="Times New Roman" w:cs="Times New Roman"/>
-          <w:color w:val="000000" w:themeColor="text1"/>
-          <w:sz w:val="18"/>
-          <w:szCs w:val="18"/>
-        </w:rPr>
-        <w:t>C</w:t>
-      </w:r>
-      <w:r>
-        <w:rPr>
-          <w:rFonts w:ascii="Times New Roman" w:eastAsia="Times New Roman" w:hAnsi="Times New Roman" w:cs="Times New Roman"/>
-          <w:color w:val="000000" w:themeColor="text1"/>
-          <w:sz w:val="18"/>
-          <w:szCs w:val="18"/>
-        </w:rPr>
-        <w:t>.</w:t>
+        <w:t>JPMorgan Chase</w:t>
+      </w:r>
+      <w:r>
+        <w:rPr>
+          <w:rFonts w:ascii="Times New Roman" w:eastAsia="Times New Roman" w:hAnsi="Times New Roman" w:cs="Times New Roman"/>
+          <w:b/>
+          <w:bCs/>
+          <w:color w:val="000000" w:themeColor="text1"/>
+          <w:sz w:val="18"/>
+          <w:szCs w:val="18"/>
+        </w:rPr>
+        <w:tab/>
+      </w:r>
+      <w:r>
+        <w:rPr>
+          <w:rFonts w:ascii="Times New Roman" w:eastAsia="Times New Roman" w:hAnsi="Times New Roman" w:cs="Times New Roman"/>
+          <w:b/>
+          <w:bCs/>
+          <w:color w:val="000000" w:themeColor="text1"/>
+          <w:sz w:val="18"/>
+          <w:szCs w:val="18"/>
+        </w:rPr>
+        <w:tab/>
+      </w:r>
+      <w:r>
+        <w:rPr>
+          <w:rFonts w:ascii="Times New Roman" w:eastAsia="Times New Roman" w:hAnsi="Times New Roman" w:cs="Times New Roman"/>
+          <w:b/>
+          <w:bCs/>
+          <w:color w:val="000000" w:themeColor="text1"/>
+          <w:sz w:val="18"/>
+          <w:szCs w:val="18"/>
+        </w:rPr>
+        <w:tab/>
+      </w:r>
+      <w:r>
+        <w:rPr>
+          <w:rFonts w:ascii="Times New Roman" w:eastAsia="Times New Roman" w:hAnsi="Times New Roman" w:cs="Times New Roman"/>
+          <w:b/>
+          <w:bCs/>
+          <w:color w:val="000000" w:themeColor="text1"/>
+          <w:sz w:val="18"/>
+          <w:szCs w:val="18"/>
+        </w:rPr>
+        <w:tab/>
+      </w:r>
+      <w:r>
+        <w:rPr>
+          <w:rFonts w:ascii="Times New Roman" w:eastAsia="Times New Roman" w:hAnsi="Times New Roman" w:cs="Times New Roman"/>
+          <w:b/>
+          <w:bCs/>
+          <w:color w:val="000000" w:themeColor="text1"/>
+          <w:sz w:val="18"/>
+          <w:szCs w:val="18"/>
+        </w:rPr>
+        <w:tab/>
+      </w:r>
+      <w:r>
+        <w:rPr>
+          <w:rFonts w:ascii="Times New Roman" w:eastAsia="Times New Roman" w:hAnsi="Times New Roman" w:cs="Times New Roman"/>
+          <w:b/>
+          <w:bCs/>
+          <w:color w:val="000000" w:themeColor="text1"/>
+          <w:sz w:val="18"/>
+          <w:szCs w:val="18"/>
+        </w:rPr>
+        <w:tab/>
+      </w:r>
+      <w:r>
+        <w:rPr>
+          <w:rFonts w:ascii="Times New Roman" w:eastAsia="Times New Roman" w:hAnsi="Times New Roman" w:cs="Times New Roman"/>
+          <w:b/>
+          <w:bCs/>
+          <w:color w:val="000000" w:themeColor="text1"/>
+          <w:sz w:val="18"/>
+          <w:szCs w:val="18"/>
+        </w:rPr>
+        <w:tab/>
+      </w:r>
+      <w:r>
+        <w:rPr>
+          <w:rFonts w:ascii="Times New Roman" w:eastAsia="Times New Roman" w:hAnsi="Times New Roman" w:cs="Times New Roman"/>
+          <w:b/>
+          <w:bCs/>
+          <w:color w:val="000000" w:themeColor="text1"/>
+          <w:sz w:val="18"/>
+          <w:szCs w:val="18"/>
+        </w:rPr>
+        <w:tab/>
+      </w:r>
+      <w:r>
+        <w:rPr>
+          <w:rFonts w:ascii="Times New Roman" w:eastAsia="Times New Roman" w:hAnsi="Times New Roman" w:cs="Times New Roman"/>
+          <w:b/>
+          <w:bCs/>
+          <w:color w:val="000000" w:themeColor="text1"/>
+          <w:sz w:val="18"/>
+          <w:szCs w:val="18"/>
+        </w:rPr>
+        <w:tab/>
+      </w:r>
+      <w:r>
+        <w:rPr>
+          <w:rFonts w:ascii="Times New Roman" w:eastAsia="Times New Roman" w:hAnsi="Times New Roman" w:cs="Times New Roman"/>
+          <w:b/>
+          <w:bCs/>
+          <w:color w:val="000000" w:themeColor="text1"/>
+          <w:sz w:val="18"/>
+          <w:szCs w:val="18"/>
+        </w:rPr>
+        <w:tab/>
+      </w:r>
+      <w:r>
+        <w:rPr>
+          <w:rFonts w:ascii="Times New Roman" w:eastAsia="Times New Roman" w:hAnsi="Times New Roman" w:cs="Times New Roman"/>
+          <w:b/>
+          <w:bCs/>
+          <w:color w:val="000000" w:themeColor="text1"/>
+          <w:sz w:val="18"/>
+          <w:szCs w:val="18"/>
+        </w:rPr>
+        <w:tab/>
+      </w:r>
+      <w:r>
+        <w:rPr>
+          <w:rFonts w:ascii="Times New Roman" w:eastAsia="Times New Roman" w:hAnsi="Times New Roman" w:cs="Times New Roman"/>
+          <w:b/>
+          <w:bCs/>
+          <w:color w:val="000000" w:themeColor="text1"/>
+          <w:sz w:val="18"/>
+          <w:szCs w:val="18"/>
+        </w:rPr>
+        <w:tab/>
+        <w:t xml:space="preserve">            </w:t>
+      </w:r>
+      <w:r>
+        <w:rPr>
+          <w:rFonts w:ascii="Times New Roman" w:eastAsia="Times New Roman" w:hAnsi="Times New Roman" w:cs="Times New Roman"/>
+          <w:color w:val="000000" w:themeColor="text1"/>
+          <w:sz w:val="18"/>
+          <w:szCs w:val="18"/>
+        </w:rPr>
+        <w:t>New York City</w:t>
+      </w:r>
+      <w:r>
+        <w:rPr>
+          <w:rFonts w:ascii="Times New Roman" w:eastAsia="Times New Roman" w:hAnsi="Times New Roman" w:cs="Times New Roman"/>
+          <w:color w:val="000000" w:themeColor="text1"/>
+          <w:sz w:val="18"/>
+          <w:szCs w:val="18"/>
+        </w:rPr>
+        <w:t>, NY</w:t>
       </w:r>
     </w:p>
     <w:p>
@@ -1255,125 +795,107 @@
           <w:sz w:val="18"/>
           <w:szCs w:val="18"/>
         </w:rPr>
-        <w:t>Quantitative Analytics Intern</w:t>
-      </w:r>
-      <w:r>
-        <w:rPr>
-          <w:rFonts w:ascii="Times New Roman" w:eastAsia="Times New Roman" w:hAnsi="Times New Roman" w:cs="Times New Roman"/>
-          <w:color w:val="000000" w:themeColor="text1"/>
-          <w:sz w:val="18"/>
-          <w:szCs w:val="18"/>
-        </w:rPr>
-        <w:tab/>
-      </w:r>
-      <w:r>
-        <w:rPr>
-          <w:rFonts w:ascii="Times New Roman" w:eastAsia="Times New Roman" w:hAnsi="Times New Roman" w:cs="Times New Roman"/>
-          <w:color w:val="000000" w:themeColor="text1"/>
-          <w:sz w:val="18"/>
-          <w:szCs w:val="18"/>
-        </w:rPr>
-        <w:tab/>
-      </w:r>
-      <w:r>
-        <w:rPr>
-          <w:rFonts w:ascii="Times New Roman" w:eastAsia="Times New Roman" w:hAnsi="Times New Roman" w:cs="Times New Roman"/>
-          <w:color w:val="000000" w:themeColor="text1"/>
-          <w:sz w:val="18"/>
-          <w:szCs w:val="18"/>
-        </w:rPr>
-        <w:tab/>
-      </w:r>
-      <w:r>
-        <w:rPr>
-          <w:rFonts w:ascii="Times New Roman" w:eastAsia="Times New Roman" w:hAnsi="Times New Roman" w:cs="Times New Roman"/>
-          <w:color w:val="000000" w:themeColor="text1"/>
-          <w:sz w:val="18"/>
-          <w:szCs w:val="18"/>
-        </w:rPr>
-        <w:tab/>
-      </w:r>
-      <w:r>
-        <w:rPr>
-          <w:rFonts w:ascii="Times New Roman" w:eastAsia="Times New Roman" w:hAnsi="Times New Roman" w:cs="Times New Roman"/>
-          <w:color w:val="000000" w:themeColor="text1"/>
-          <w:sz w:val="18"/>
-          <w:szCs w:val="18"/>
-        </w:rPr>
-        <w:tab/>
-      </w:r>
-      <w:r>
-        <w:rPr>
-          <w:rFonts w:ascii="Times New Roman" w:eastAsia="Times New Roman" w:hAnsi="Times New Roman" w:cs="Times New Roman"/>
-          <w:color w:val="000000" w:themeColor="text1"/>
-          <w:sz w:val="18"/>
-          <w:szCs w:val="18"/>
-        </w:rPr>
-        <w:tab/>
-      </w:r>
-      <w:r>
-        <w:rPr>
-          <w:rFonts w:ascii="Times New Roman" w:eastAsia="Times New Roman" w:hAnsi="Times New Roman" w:cs="Times New Roman"/>
-          <w:color w:val="000000" w:themeColor="text1"/>
-          <w:sz w:val="18"/>
-          <w:szCs w:val="18"/>
-        </w:rPr>
-        <w:tab/>
-      </w:r>
-      <w:r>
-        <w:rPr>
-          <w:rFonts w:ascii="Times New Roman" w:eastAsia="Times New Roman" w:hAnsi="Times New Roman" w:cs="Times New Roman"/>
-          <w:color w:val="000000" w:themeColor="text1"/>
-          <w:sz w:val="18"/>
-          <w:szCs w:val="18"/>
-        </w:rPr>
-        <w:tab/>
-      </w:r>
-      <w:r>
-        <w:rPr>
-          <w:rFonts w:ascii="Times New Roman" w:eastAsia="Times New Roman" w:hAnsi="Times New Roman" w:cs="Times New Roman"/>
-          <w:color w:val="000000" w:themeColor="text1"/>
-          <w:sz w:val="18"/>
-          <w:szCs w:val="18"/>
-        </w:rPr>
-        <w:tab/>
-      </w:r>
-      <w:r>
-        <w:rPr>
-          <w:rFonts w:ascii="Times New Roman" w:eastAsia="Times New Roman" w:hAnsi="Times New Roman" w:cs="Times New Roman"/>
-          <w:color w:val="000000" w:themeColor="text1"/>
-          <w:sz w:val="18"/>
-          <w:szCs w:val="18"/>
-        </w:rPr>
-        <w:tab/>
-      </w:r>
-      <w:r>
-        <w:rPr>
-          <w:rFonts w:ascii="Times New Roman" w:eastAsia="Times New Roman" w:hAnsi="Times New Roman" w:cs="Times New Roman"/>
-          <w:color w:val="000000" w:themeColor="text1"/>
-          <w:sz w:val="18"/>
-          <w:szCs w:val="18"/>
-        </w:rPr>
-        <w:tab/>
-        <w:t xml:space="preserve">   June 2026 </w:t>
-      </w:r>
-      <w:r>
-        <w:rPr>
-          <w:rFonts w:ascii="Times New Roman" w:eastAsia="Times New Roman" w:hAnsi="Times New Roman" w:cs="Times New Roman"/>
-          <w:color w:val="000000" w:themeColor="text1"/>
-          <w:sz w:val="18"/>
-          <w:szCs w:val="18"/>
-        </w:rPr>
-        <w:t>–</w:t>
-      </w:r>
-      <w:r>
-        <w:rPr>
-          <w:rFonts w:ascii="Times New Roman" w:eastAsia="Times New Roman" w:hAnsi="Times New Roman" w:cs="Times New Roman"/>
-          <w:color w:val="000000" w:themeColor="text1"/>
-          <w:sz w:val="18"/>
-          <w:szCs w:val="18"/>
-        </w:rPr>
-        <w:t xml:space="preserve"> August 2026</w:t>
+        <w:t>Data for Good Hackathon Participant</w:t>
+      </w:r>
+      <w:r>
+        <w:rPr>
+          <w:rFonts w:ascii="Times New Roman" w:eastAsia="Times New Roman" w:hAnsi="Times New Roman" w:cs="Times New Roman"/>
+          <w:color w:val="000000" w:themeColor="text1"/>
+          <w:sz w:val="18"/>
+          <w:szCs w:val="18"/>
+        </w:rPr>
+        <w:tab/>
+      </w:r>
+      <w:r>
+        <w:rPr>
+          <w:rFonts w:ascii="Times New Roman" w:eastAsia="Times New Roman" w:hAnsi="Times New Roman" w:cs="Times New Roman"/>
+          <w:color w:val="000000" w:themeColor="text1"/>
+          <w:sz w:val="18"/>
+          <w:szCs w:val="18"/>
+        </w:rPr>
+        <w:tab/>
+      </w:r>
+      <w:r>
+        <w:rPr>
+          <w:rFonts w:ascii="Times New Roman" w:eastAsia="Times New Roman" w:hAnsi="Times New Roman" w:cs="Times New Roman"/>
+          <w:color w:val="000000" w:themeColor="text1"/>
+          <w:sz w:val="18"/>
+          <w:szCs w:val="18"/>
+        </w:rPr>
+        <w:tab/>
+      </w:r>
+      <w:r>
+        <w:rPr>
+          <w:rFonts w:ascii="Times New Roman" w:eastAsia="Times New Roman" w:hAnsi="Times New Roman" w:cs="Times New Roman"/>
+          <w:color w:val="000000" w:themeColor="text1"/>
+          <w:sz w:val="18"/>
+          <w:szCs w:val="18"/>
+        </w:rPr>
+        <w:tab/>
+      </w:r>
+      <w:r>
+        <w:rPr>
+          <w:rFonts w:ascii="Times New Roman" w:eastAsia="Times New Roman" w:hAnsi="Times New Roman" w:cs="Times New Roman"/>
+          <w:color w:val="000000" w:themeColor="text1"/>
+          <w:sz w:val="18"/>
+          <w:szCs w:val="18"/>
+        </w:rPr>
+        <w:tab/>
+      </w:r>
+      <w:r>
+        <w:rPr>
+          <w:rFonts w:ascii="Times New Roman" w:eastAsia="Times New Roman" w:hAnsi="Times New Roman" w:cs="Times New Roman"/>
+          <w:color w:val="000000" w:themeColor="text1"/>
+          <w:sz w:val="18"/>
+          <w:szCs w:val="18"/>
+        </w:rPr>
+        <w:tab/>
+      </w:r>
+      <w:r>
+        <w:rPr>
+          <w:rFonts w:ascii="Times New Roman" w:eastAsia="Times New Roman" w:hAnsi="Times New Roman" w:cs="Times New Roman"/>
+          <w:color w:val="000000" w:themeColor="text1"/>
+          <w:sz w:val="18"/>
+          <w:szCs w:val="18"/>
+        </w:rPr>
+        <w:tab/>
+      </w:r>
+      <w:r>
+        <w:rPr>
+          <w:rFonts w:ascii="Times New Roman" w:eastAsia="Times New Roman" w:hAnsi="Times New Roman" w:cs="Times New Roman"/>
+          <w:color w:val="000000" w:themeColor="text1"/>
+          <w:sz w:val="18"/>
+          <w:szCs w:val="18"/>
+        </w:rPr>
+        <w:tab/>
+      </w:r>
+      <w:r>
+        <w:rPr>
+          <w:rFonts w:ascii="Times New Roman" w:eastAsia="Times New Roman" w:hAnsi="Times New Roman" w:cs="Times New Roman"/>
+          <w:color w:val="000000" w:themeColor="text1"/>
+          <w:sz w:val="18"/>
+          <w:szCs w:val="18"/>
+        </w:rPr>
+        <w:tab/>
+      </w:r>
+      <w:r>
+        <w:rPr>
+          <w:rFonts w:ascii="Times New Roman" w:eastAsia="Times New Roman" w:hAnsi="Times New Roman" w:cs="Times New Roman"/>
+          <w:color w:val="000000" w:themeColor="text1"/>
+          <w:sz w:val="18"/>
+          <w:szCs w:val="18"/>
+        </w:rPr>
+        <w:tab/>
+      </w:r>
+      <w:r>
+        <w:rPr>
+          <w:rFonts w:ascii="Times New Roman" w:eastAsia="Times New Roman" w:hAnsi="Times New Roman" w:cs="Times New Roman"/>
+          <w:color w:val="000000" w:themeColor="text1"/>
+          <w:sz w:val="18"/>
+          <w:szCs w:val="18"/>
+        </w:rPr>
+        <w:tab/>
+        <w:t xml:space="preserve">      October 2026</w:t>
       </w:r>
     </w:p>
     <w:p>
@@ -1399,121 +921,397 @@
           <w:sz w:val="18"/>
           <w:szCs w:val="18"/>
         </w:rPr>
-        <w:t xml:space="preserve">Collaborated in managing </w:t>
-      </w:r>
-      <w:r>
-        <w:rPr>
-          <w:rFonts w:ascii="Times New Roman" w:eastAsia="Times New Roman" w:hAnsi="Times New Roman" w:cs="Times New Roman"/>
-          <w:color w:val="000000" w:themeColor="text1"/>
-          <w:sz w:val="18"/>
-          <w:szCs w:val="18"/>
-        </w:rPr>
-        <w:t xml:space="preserve">over </w:t>
-      </w:r>
-      <w:r>
-        <w:rPr>
-          <w:rFonts w:ascii="Times New Roman" w:eastAsia="Times New Roman" w:hAnsi="Times New Roman" w:cs="Times New Roman"/>
-          <w:b/>
-          <w:bCs/>
-          <w:color w:val="000000" w:themeColor="text1"/>
-          <w:sz w:val="18"/>
-          <w:szCs w:val="18"/>
-        </w:rPr>
-        <w:t>400</w:t>
-      </w:r>
-      <w:r>
-        <w:rPr>
-          <w:rFonts w:ascii="Times New Roman" w:eastAsia="Times New Roman" w:hAnsi="Times New Roman" w:cs="Times New Roman"/>
-          <w:color w:val="000000" w:themeColor="text1"/>
-          <w:sz w:val="18"/>
-          <w:szCs w:val="18"/>
-        </w:rPr>
-        <w:t xml:space="preserve"> models across PNC's inventory, including a CCAR/DFAST loss-forecasting model </w:t>
-      </w:r>
-      <w:r>
-        <w:rPr>
-          <w:rFonts w:ascii="Times New Roman" w:eastAsia="Times New Roman" w:hAnsi="Times New Roman" w:cs="Times New Roman"/>
-          <w:color w:val="000000" w:themeColor="text1"/>
-          <w:sz w:val="18"/>
-          <w:szCs w:val="18"/>
-        </w:rPr>
-        <w:t>developed through</w:t>
-      </w:r>
-      <w:r>
-        <w:rPr>
-          <w:rFonts w:ascii="Times New Roman" w:eastAsia="Times New Roman" w:hAnsi="Times New Roman" w:cs="Times New Roman"/>
-          <w:color w:val="000000" w:themeColor="text1"/>
-          <w:sz w:val="18"/>
-          <w:szCs w:val="18"/>
-        </w:rPr>
-        <w:t xml:space="preserve"> </w:t>
-      </w:r>
-      <w:r>
-        <w:rPr>
-          <w:rFonts w:ascii="Times New Roman" w:eastAsia="Times New Roman" w:hAnsi="Times New Roman" w:cs="Times New Roman"/>
-          <w:b/>
-          <w:bCs/>
-          <w:color w:val="000000" w:themeColor="text1"/>
-          <w:sz w:val="18"/>
-          <w:szCs w:val="18"/>
-        </w:rPr>
-        <w:t>1,000</w:t>
-      </w:r>
-      <w:r>
-        <w:rPr>
-          <w:rFonts w:ascii="Times New Roman" w:eastAsia="Times New Roman" w:hAnsi="Times New Roman" w:cs="Times New Roman"/>
-          <w:color w:val="000000" w:themeColor="text1"/>
-          <w:sz w:val="18"/>
-          <w:szCs w:val="18"/>
-        </w:rPr>
-        <w:t xml:space="preserve"> Monte Carlo simulations, testing a </w:t>
-      </w:r>
-      <w:r>
-        <w:rPr>
-          <w:rFonts w:ascii="Times New Roman" w:eastAsia="Times New Roman" w:hAnsi="Times New Roman" w:cs="Times New Roman"/>
-          <w:b/>
-          <w:bCs/>
-          <w:color w:val="000000" w:themeColor="text1"/>
-          <w:sz w:val="18"/>
-          <w:szCs w:val="18"/>
-        </w:rPr>
-        <w:t>90</w:t>
-      </w:r>
-      <w:r>
-        <w:rPr>
-          <w:rFonts w:ascii="Times New Roman" w:eastAsia="Times New Roman" w:hAnsi="Times New Roman" w:cs="Times New Roman"/>
-          <w:color w:val="000000" w:themeColor="text1"/>
-          <w:sz w:val="18"/>
-          <w:szCs w:val="18"/>
-        </w:rPr>
-        <w:t xml:space="preserve">% prediction interval against actual quarterly results, deployed </w:t>
-      </w:r>
-      <w:r>
-        <w:rPr>
-          <w:rFonts w:ascii="Times New Roman" w:eastAsia="Times New Roman" w:hAnsi="Times New Roman" w:cs="Times New Roman"/>
-          <w:color w:val="000000" w:themeColor="text1"/>
-          <w:sz w:val="18"/>
-          <w:szCs w:val="18"/>
-        </w:rPr>
-        <w:t>using</w:t>
-      </w:r>
-      <w:r>
-        <w:rPr>
-          <w:rFonts w:ascii="Times New Roman" w:eastAsia="Times New Roman" w:hAnsi="Times New Roman" w:cs="Times New Roman"/>
-          <w:color w:val="000000" w:themeColor="text1"/>
-          <w:sz w:val="18"/>
-          <w:szCs w:val="18"/>
-        </w:rPr>
-        <w:t xml:space="preserve"> Python's pickle library</w:t>
-      </w:r>
-      <w:r>
-        <w:rPr>
-          <w:rFonts w:ascii="Times New Roman" w:eastAsia="Times New Roman" w:hAnsi="Times New Roman" w:cs="Times New Roman"/>
-          <w:color w:val="000000" w:themeColor="text1"/>
-          <w:sz w:val="18"/>
-          <w:szCs w:val="18"/>
-        </w:rPr>
-        <w:t>.</w:t>
+        <w:t xml:space="preserve">Selected as 1 of </w:t>
+      </w:r>
+      <w:r>
+        <w:rPr>
+          <w:rFonts w:ascii="Times New Roman" w:eastAsia="Times New Roman" w:hAnsi="Times New Roman" w:cs="Times New Roman"/>
+          <w:b/>
+          <w:bCs/>
+          <w:color w:val="000000" w:themeColor="text1"/>
+          <w:sz w:val="18"/>
+          <w:szCs w:val="18"/>
+        </w:rPr>
+        <w:t xml:space="preserve">50</w:t>
+      </w:r>
+      <w:r>
+        <w:rPr>
+          <w:rFonts w:ascii="Times New Roman" w:eastAsia="Times New Roman" w:hAnsi="Times New Roman" w:cs="Times New Roman"/>
+          <w:color w:val="000000" w:themeColor="text1"/>
+          <w:sz w:val="18"/>
+          <w:szCs w:val="18"/>
+        </w:rPr>
+        <w:t xml:space="preserve"> participants to partner with the NBPA, modeling </w:t>
+      </w:r>
+      <w:r>
+        <w:rPr>
+          <w:rFonts w:ascii="Times New Roman" w:eastAsia="Times New Roman" w:hAnsi="Times New Roman" w:cs="Times New Roman"/>
+          <w:b/>
+          <w:bCs/>
+          <w:color w:val="000000" w:themeColor="text1"/>
+          <w:sz w:val="18"/>
+          <w:szCs w:val="18"/>
+        </w:rPr>
+        <w:t xml:space="preserve">6,150</w:t>
+      </w:r>
+      <w:r>
+        <w:rPr>
+          <w:rFonts w:ascii="Times New Roman" w:eastAsia="Times New Roman" w:hAnsi="Times New Roman" w:cs="Times New Roman"/>
+          <w:color w:val="000000" w:themeColor="text1"/>
+          <w:sz w:val="18"/>
+          <w:szCs w:val="18"/>
+        </w:rPr>
+        <w:t xml:space="preserve"> NBA games in Python (statsmodels) to show back-to-backs cost </w:t>
+      </w:r>
+      <w:r>
+        <w:rPr>
+          <w:rFonts w:ascii="Times New Roman" w:eastAsia="Times New Roman" w:hAnsi="Times New Roman" w:cs="Times New Roman"/>
+          <w:b/>
+          <w:bCs/>
+          <w:color w:val="000000" w:themeColor="text1"/>
+          <w:sz w:val="18"/>
+          <w:szCs w:val="18"/>
+        </w:rPr>
+        <w:t xml:space="preserve">2.4</w:t>
+      </w:r>
+      <w:r>
+        <w:rPr>
+          <w:rFonts w:ascii="Times New Roman" w:eastAsia="Times New Roman" w:hAnsi="Times New Roman" w:cs="Times New Roman"/>
+          <w:color w:val="000000" w:themeColor="text1"/>
+          <w:sz w:val="18"/>
+          <w:szCs w:val="18"/>
+        </w:rPr>
+        <w:t xml:space="preserve"> points of Net Rating per 100 possessions, and designed a dashboard with a schedule optimizer cutting back-to-backs by </w:t>
+      </w:r>
+      <w:r>
+        <w:rPr>
+          <w:rFonts w:ascii="Times New Roman" w:eastAsia="Times New Roman" w:hAnsi="Times New Roman" w:cs="Times New Roman"/>
+          <w:b/>
+          <w:bCs/>
+          <w:color w:val="000000" w:themeColor="text1"/>
+          <w:sz w:val="18"/>
+          <w:szCs w:val="18"/>
+        </w:rPr>
+        <w:t xml:space="preserve">50</w:t>
+      </w:r>
+      <w:r>
+        <w:rPr>
+          <w:rFonts w:ascii="Times New Roman" w:eastAsia="Times New Roman" w:hAnsi="Times New Roman" w:cs="Times New Roman"/>
+          <w:color w:val="000000" w:themeColor="text1"/>
+          <w:sz w:val="18"/>
+          <w:szCs w:val="18"/>
+        </w:rPr>
+        <w:t xml:space="preserve">%.</w:t>
+      </w:r>
+    </w:p>
+    <w:p>
+      <w:pPr>
+        <w:pStyle w:val="ListParagraph"/>
+        <w:spacing w:after="0" w:line="240" w:lineRule="auto"/>
+        <w:ind w:left="0"/>
+        <w:rPr>
+          <w:rFonts w:ascii="Times New Roman" w:eastAsia="Times New Roman" w:hAnsi="Times New Roman" w:cs="Times New Roman"/>
+          <w:color w:val="000000" w:themeColor="text1"/>
+          <w:sz w:val="18"/>
+          <w:szCs w:val="18"/>
+        </w:rPr>
+      </w:pPr>
+      <w:r>
+        <w:rPr>
+          <w:rFonts w:ascii="Times New Roman" w:eastAsia="Times New Roman" w:hAnsi="Times New Roman" w:cs="Times New Roman"/>
+          <w:b/>
+          <w:bCs/>
+          <w:color w:val="000000" w:themeColor="text1"/>
+          <w:sz w:val="18"/>
+          <w:szCs w:val="18"/>
+        </w:rPr>
+        <w:t>PNC</w:t>
+      </w:r>
+      <w:r>
+        <w:rPr>
+          <w:rFonts w:ascii="Times New Roman" w:eastAsia="Times New Roman" w:hAnsi="Times New Roman" w:cs="Times New Roman"/>
+          <w:b/>
+          <w:bCs/>
+          <w:color w:val="000000" w:themeColor="text1"/>
+          <w:sz w:val="18"/>
+          <w:szCs w:val="18"/>
+        </w:rPr>
+        <w:tab/>
+      </w:r>
+      <w:r>
+        <w:rPr>
+          <w:rFonts w:ascii="Times New Roman" w:eastAsia="Times New Roman" w:hAnsi="Times New Roman" w:cs="Times New Roman"/>
+          <w:b/>
+          <w:bCs/>
+          <w:color w:val="000000" w:themeColor="text1"/>
+          <w:sz w:val="18"/>
+          <w:szCs w:val="18"/>
+        </w:rPr>
+        <w:tab/>
+      </w:r>
+      <w:r>
+        <w:rPr>
+          <w:rFonts w:ascii="Times New Roman" w:eastAsia="Times New Roman" w:hAnsi="Times New Roman" w:cs="Times New Roman"/>
+          <w:b/>
+          <w:bCs/>
+          <w:color w:val="000000" w:themeColor="text1"/>
+          <w:sz w:val="18"/>
+          <w:szCs w:val="18"/>
+        </w:rPr>
+        <w:tab/>
+      </w:r>
+      <w:r>
+        <w:rPr>
+          <w:rFonts w:ascii="Times New Roman" w:eastAsia="Times New Roman" w:hAnsi="Times New Roman" w:cs="Times New Roman"/>
+          <w:b/>
+          <w:bCs/>
+          <w:color w:val="000000" w:themeColor="text1"/>
+          <w:sz w:val="18"/>
+          <w:szCs w:val="18"/>
+        </w:rPr>
+        <w:tab/>
+      </w:r>
+      <w:r>
+        <w:rPr>
+          <w:rFonts w:ascii="Times New Roman" w:eastAsia="Times New Roman" w:hAnsi="Times New Roman" w:cs="Times New Roman"/>
+          <w:b/>
+          <w:bCs/>
+          <w:color w:val="000000" w:themeColor="text1"/>
+          <w:sz w:val="18"/>
+          <w:szCs w:val="18"/>
+        </w:rPr>
+        <w:tab/>
+      </w:r>
+      <w:r>
+        <w:rPr>
+          <w:rFonts w:ascii="Times New Roman" w:eastAsia="Times New Roman" w:hAnsi="Times New Roman" w:cs="Times New Roman"/>
+          <w:b/>
+          <w:bCs/>
+          <w:color w:val="000000" w:themeColor="text1"/>
+          <w:sz w:val="18"/>
+          <w:szCs w:val="18"/>
+        </w:rPr>
+        <w:tab/>
+      </w:r>
+      <w:r>
+        <w:rPr>
+          <w:rFonts w:ascii="Times New Roman" w:eastAsia="Times New Roman" w:hAnsi="Times New Roman" w:cs="Times New Roman"/>
+          <w:b/>
+          <w:bCs/>
+          <w:color w:val="000000" w:themeColor="text1"/>
+          <w:sz w:val="18"/>
+          <w:szCs w:val="18"/>
+        </w:rPr>
+        <w:tab/>
+      </w:r>
+      <w:r>
+        <w:rPr>
+          <w:rFonts w:ascii="Times New Roman" w:eastAsia="Times New Roman" w:hAnsi="Times New Roman" w:cs="Times New Roman"/>
+          <w:b/>
+          <w:bCs/>
+          <w:color w:val="000000" w:themeColor="text1"/>
+          <w:sz w:val="18"/>
+          <w:szCs w:val="18"/>
+        </w:rPr>
+        <w:tab/>
+      </w:r>
+      <w:r>
+        <w:rPr>
+          <w:rFonts w:ascii="Times New Roman" w:eastAsia="Times New Roman" w:hAnsi="Times New Roman" w:cs="Times New Roman"/>
+          <w:b/>
+          <w:bCs/>
+          <w:color w:val="000000" w:themeColor="text1"/>
+          <w:sz w:val="18"/>
+          <w:szCs w:val="18"/>
+        </w:rPr>
+        <w:tab/>
+      </w:r>
+      <w:r>
+        <w:rPr>
+          <w:rFonts w:ascii="Times New Roman" w:eastAsia="Times New Roman" w:hAnsi="Times New Roman" w:cs="Times New Roman"/>
+          <w:b/>
+          <w:bCs/>
+          <w:color w:val="000000" w:themeColor="text1"/>
+          <w:sz w:val="18"/>
+          <w:szCs w:val="18"/>
+        </w:rPr>
+        <w:tab/>
+      </w:r>
+      <w:r>
+        <w:rPr>
+          <w:rFonts w:ascii="Times New Roman" w:eastAsia="Times New Roman" w:hAnsi="Times New Roman" w:cs="Times New Roman"/>
+          <w:b/>
+          <w:bCs/>
+          <w:color w:val="000000" w:themeColor="text1"/>
+          <w:sz w:val="18"/>
+          <w:szCs w:val="18"/>
+        </w:rPr>
+        <w:tab/>
+      </w:r>
+      <w:r>
+        <w:rPr>
+          <w:rFonts w:ascii="Times New Roman" w:eastAsia="Times New Roman" w:hAnsi="Times New Roman" w:cs="Times New Roman"/>
+          <w:b/>
+          <w:bCs/>
+          <w:color w:val="000000" w:themeColor="text1"/>
+          <w:sz w:val="18"/>
+          <w:szCs w:val="18"/>
+        </w:rPr>
+        <w:tab/>
+      </w:r>
+      <w:r>
+        <w:rPr>
+          <w:rFonts w:ascii="Times New Roman" w:eastAsia="Times New Roman" w:hAnsi="Times New Roman" w:cs="Times New Roman"/>
+          <w:b/>
+          <w:bCs/>
+          <w:color w:val="000000" w:themeColor="text1"/>
+          <w:sz w:val="18"/>
+          <w:szCs w:val="18"/>
+        </w:rPr>
+        <w:tab/>
+        <w:t xml:space="preserve">   </w:t>
+      </w:r>
+      <w:r>
+        <w:rPr>
+          <w:rFonts w:ascii="Times New Roman" w:eastAsia="Times New Roman" w:hAnsi="Times New Roman" w:cs="Times New Roman"/>
+          <w:b/>
+          <w:bCs/>
+          <w:color w:val="000000" w:themeColor="text1"/>
+          <w:sz w:val="18"/>
+          <w:szCs w:val="18"/>
+        </w:rPr>
+        <w:tab/>
+      </w:r>
+      <w:r>
+        <w:rPr>
+          <w:rFonts w:ascii="Times New Roman" w:eastAsia="Times New Roman" w:hAnsi="Times New Roman" w:cs="Times New Roman"/>
+          <w:color w:val="000000" w:themeColor="text1"/>
+          <w:sz w:val="18"/>
+          <w:szCs w:val="18"/>
+        </w:rPr>
+        <w:t>Washington D.C.</w:t>
+      </w:r>
+    </w:p>
+    <w:p>
+      <w:pPr>
+        <w:pStyle w:val="ListParagraph"/>
+        <w:spacing w:after="0" w:line="240" w:lineRule="auto"/>
+        <w:ind w:left="0"/>
+        <w:rPr>
+          <w:rFonts w:ascii="Times New Roman" w:eastAsia="Times New Roman" w:hAnsi="Times New Roman" w:cs="Times New Roman"/>
+          <w:color w:val="000000" w:themeColor="text1"/>
+          <w:sz w:val="18"/>
+          <w:szCs w:val="18"/>
+        </w:rPr>
+      </w:pPr>
+      <w:r>
+        <w:rPr>
+          <w:rFonts w:ascii="Times New Roman" w:eastAsia="Times New Roman" w:hAnsi="Times New Roman" w:cs="Times New Roman"/>
+          <w:color w:val="000000" w:themeColor="text1"/>
+          <w:sz w:val="18"/>
+          <w:szCs w:val="18"/>
+        </w:rPr>
+        <w:t>Quantitative Analytics Intern</w:t>
+      </w:r>
+      <w:r>
+        <w:rPr>
+          <w:rFonts w:ascii="Times New Roman" w:eastAsia="Times New Roman" w:hAnsi="Times New Roman" w:cs="Times New Roman"/>
+          <w:color w:val="000000" w:themeColor="text1"/>
+          <w:sz w:val="18"/>
+          <w:szCs w:val="18"/>
+        </w:rPr>
+        <w:tab/>
+      </w:r>
+      <w:r>
+        <w:rPr>
+          <w:rFonts w:ascii="Times New Roman" w:eastAsia="Times New Roman" w:hAnsi="Times New Roman" w:cs="Times New Roman"/>
+          <w:color w:val="000000" w:themeColor="text1"/>
+          <w:sz w:val="18"/>
+          <w:szCs w:val="18"/>
+        </w:rPr>
+        <w:tab/>
+      </w:r>
+      <w:r>
+        <w:rPr>
+          <w:rFonts w:ascii="Times New Roman" w:eastAsia="Times New Roman" w:hAnsi="Times New Roman" w:cs="Times New Roman"/>
+          <w:color w:val="000000" w:themeColor="text1"/>
+          <w:sz w:val="18"/>
+          <w:szCs w:val="18"/>
+        </w:rPr>
+        <w:tab/>
+      </w:r>
+      <w:r>
+        <w:rPr>
+          <w:rFonts w:ascii="Times New Roman" w:eastAsia="Times New Roman" w:hAnsi="Times New Roman" w:cs="Times New Roman"/>
+          <w:color w:val="000000" w:themeColor="text1"/>
+          <w:sz w:val="18"/>
+          <w:szCs w:val="18"/>
+        </w:rPr>
+        <w:tab/>
+      </w:r>
+      <w:r>
+        <w:rPr>
+          <w:rFonts w:ascii="Times New Roman" w:eastAsia="Times New Roman" w:hAnsi="Times New Roman" w:cs="Times New Roman"/>
+          <w:color w:val="000000" w:themeColor="text1"/>
+          <w:sz w:val="18"/>
+          <w:szCs w:val="18"/>
+        </w:rPr>
+        <w:tab/>
+      </w:r>
+      <w:r>
+        <w:rPr>
+          <w:rFonts w:ascii="Times New Roman" w:eastAsia="Times New Roman" w:hAnsi="Times New Roman" w:cs="Times New Roman"/>
+          <w:color w:val="000000" w:themeColor="text1"/>
+          <w:sz w:val="18"/>
+          <w:szCs w:val="18"/>
+        </w:rPr>
+        <w:tab/>
+      </w:r>
+      <w:r>
+        <w:rPr>
+          <w:rFonts w:ascii="Times New Roman" w:eastAsia="Times New Roman" w:hAnsi="Times New Roman" w:cs="Times New Roman"/>
+          <w:color w:val="000000" w:themeColor="text1"/>
+          <w:sz w:val="18"/>
+          <w:szCs w:val="18"/>
+        </w:rPr>
+        <w:tab/>
+      </w:r>
+      <w:r>
+        <w:rPr>
+          <w:rFonts w:ascii="Times New Roman" w:eastAsia="Times New Roman" w:hAnsi="Times New Roman" w:cs="Times New Roman"/>
+          <w:color w:val="000000" w:themeColor="text1"/>
+          <w:sz w:val="18"/>
+          <w:szCs w:val="18"/>
+        </w:rPr>
+        <w:tab/>
+      </w:r>
+      <w:r>
+        <w:rPr>
+          <w:rFonts w:ascii="Times New Roman" w:eastAsia="Times New Roman" w:hAnsi="Times New Roman" w:cs="Times New Roman"/>
+          <w:color w:val="000000" w:themeColor="text1"/>
+          <w:sz w:val="18"/>
+          <w:szCs w:val="18"/>
+        </w:rPr>
+        <w:tab/>
+      </w:r>
+      <w:r>
+        <w:rPr>
+          <w:rFonts w:ascii="Times New Roman" w:eastAsia="Times New Roman" w:hAnsi="Times New Roman" w:cs="Times New Roman"/>
+          <w:color w:val="000000" w:themeColor="text1"/>
+          <w:sz w:val="18"/>
+          <w:szCs w:val="18"/>
+        </w:rPr>
+        <w:tab/>
+      </w:r>
+      <w:r>
+        <w:rPr>
+          <w:rFonts w:ascii="Times New Roman" w:eastAsia="Times New Roman" w:hAnsi="Times New Roman" w:cs="Times New Roman"/>
+          <w:color w:val="000000" w:themeColor="text1"/>
+          <w:sz w:val="18"/>
+          <w:szCs w:val="18"/>
+        </w:rPr>
+        <w:tab/>
+        <w:t xml:space="preserve">   June 2026 – August 2026</w:t>
       </w:r>
     </w:p>
     <w:p>
@@ -1539,7 +1337,111 @@
           <w:sz w:val="18"/>
           <w:szCs w:val="18"/>
         </w:rPr>
-        <w:t xml:space="preserve">Built and productionized an automated regulatory and risk intelligence pipeline in Python, monitoring internal and external sources to deliver daily reporting for Model Risk, MRMG, Audit, and OP Risk stakeholders, boosting model development output by </w:t>
+        <w:t xml:space="preserve">Applied quantitative and </w:t>
+      </w:r>
+      <w:r>
+        <w:rPr>
+          <w:rFonts w:ascii="Times New Roman" w:eastAsia="Times New Roman" w:hAnsi="Times New Roman" w:cs="Times New Roman"/>
+          <w:color w:val="000000" w:themeColor="text1"/>
+          <w:sz w:val="18"/>
+          <w:szCs w:val="18"/>
+        </w:rPr>
+        <w:t>data</w:t>
+      </w:r>
+      <w:r>
+        <w:rPr>
+          <w:rFonts w:ascii="Times New Roman" w:eastAsia="Times New Roman" w:hAnsi="Times New Roman" w:cs="Times New Roman"/>
+          <w:color w:val="000000" w:themeColor="text1"/>
+          <w:sz w:val="18"/>
+          <w:szCs w:val="18"/>
+        </w:rPr>
+        <w:t xml:space="preserve"> modeling techniques while collaborating on over </w:t>
+      </w:r>
+      <w:r>
+        <w:rPr>
+          <w:rFonts w:ascii="Times New Roman" w:eastAsia="Times New Roman" w:hAnsi="Times New Roman" w:cs="Times New Roman"/>
+          <w:b/>
+          <w:bCs/>
+          <w:color w:val="000000" w:themeColor="text1"/>
+          <w:sz w:val="18"/>
+          <w:szCs w:val="18"/>
+        </w:rPr>
+        <w:t>400</w:t>
+      </w:r>
+      <w:r>
+        <w:rPr>
+          <w:rFonts w:ascii="Times New Roman" w:eastAsia="Times New Roman" w:hAnsi="Times New Roman" w:cs="Times New Roman"/>
+          <w:color w:val="000000" w:themeColor="text1"/>
+          <w:sz w:val="18"/>
+          <w:szCs w:val="18"/>
+        </w:rPr>
+        <w:t xml:space="preserve"> models across PNC's inventory, including a CCAR/DFAST loss-forecasting model developed through </w:t>
+      </w:r>
+      <w:r>
+        <w:rPr>
+          <w:rFonts w:ascii="Times New Roman" w:eastAsia="Times New Roman" w:hAnsi="Times New Roman" w:cs="Times New Roman"/>
+          <w:b/>
+          <w:bCs/>
+          <w:color w:val="000000" w:themeColor="text1"/>
+          <w:sz w:val="18"/>
+          <w:szCs w:val="18"/>
+        </w:rPr>
+        <w:t>1,000</w:t>
+      </w:r>
+      <w:r>
+        <w:rPr>
+          <w:rFonts w:ascii="Times New Roman" w:eastAsia="Times New Roman" w:hAnsi="Times New Roman" w:cs="Times New Roman"/>
+          <w:color w:val="000000" w:themeColor="text1"/>
+          <w:sz w:val="18"/>
+          <w:szCs w:val="18"/>
+        </w:rPr>
+        <w:t xml:space="preserve"> Monte Carlo simulations, validating a </w:t>
+      </w:r>
+      <w:r>
+        <w:rPr>
+          <w:rFonts w:ascii="Times New Roman" w:eastAsia="Times New Roman" w:hAnsi="Times New Roman" w:cs="Times New Roman"/>
+          <w:b/>
+          <w:bCs/>
+          <w:color w:val="000000" w:themeColor="text1"/>
+          <w:sz w:val="18"/>
+          <w:szCs w:val="18"/>
+        </w:rPr>
+        <w:t>90</w:t>
+      </w:r>
+      <w:r>
+        <w:rPr>
+          <w:rFonts w:ascii="Times New Roman" w:eastAsia="Times New Roman" w:hAnsi="Times New Roman" w:cs="Times New Roman"/>
+          <w:color w:val="000000" w:themeColor="text1"/>
+          <w:sz w:val="18"/>
+          <w:szCs w:val="18"/>
+        </w:rPr>
+        <w:t>% prediction interval against actual quarterly results, deployed using Python's pickle library.</w:t>
+      </w:r>
+    </w:p>
+    <w:p>
+      <w:pPr>
+        <w:pStyle w:val="ListParagraph"/>
+        <w:numPr>
+          <w:ilvl w:val="0"/>
+          <w:numId w:val="24"/>
+        </w:numPr>
+        <w:spacing w:after="0" w:line="240" w:lineRule="auto"/>
+        <w:ind w:left="504"/>
+        <w:rPr>
+          <w:rFonts w:ascii="Times New Roman" w:eastAsia="Times New Roman" w:hAnsi="Times New Roman" w:cs="Times New Roman"/>
+          <w:color w:val="000000" w:themeColor="text1"/>
+          <w:sz w:val="18"/>
+          <w:szCs w:val="18"/>
+        </w:rPr>
+      </w:pPr>
+      <w:r>
+        <w:rPr>
+          <w:rFonts w:ascii="Times New Roman" w:eastAsia="Times New Roman" w:hAnsi="Times New Roman" w:cs="Times New Roman"/>
+          <w:color w:val="000000" w:themeColor="text1"/>
+          <w:sz w:val="18"/>
+          <w:szCs w:val="18"/>
+        </w:rPr>
+        <w:t xml:space="preserve">Built and productionized an automated Python data pipeline for regulatory and risk analytics, monitoring internal and external sources to deliver daily reporting for Model Risk, MRMG, Audit, and OP Risk stakeholders, boosting model development output by </w:t>
       </w:r>
       <w:r>
         <w:rPr>
@@ -1585,65 +1487,7 @@
           <w:sz w:val="18"/>
           <w:szCs w:val="18"/>
         </w:rPr>
-        <w:t xml:space="preserve">Engineered an end-to-end Hadoop pipeline (Python, </w:t>
-      </w:r>
-      <w:proofErr w:type="spellStart"/>
-      <w:r>
-        <w:rPr>
-          <w:rFonts w:ascii="Times New Roman" w:eastAsia="Times New Roman" w:hAnsi="Times New Roman" w:cs="Times New Roman"/>
-          <w:color w:val="000000" w:themeColor="text1"/>
-          <w:sz w:val="18"/>
-          <w:szCs w:val="18"/>
-        </w:rPr>
-        <w:t>PySpark</w:t>
-      </w:r>
-      <w:proofErr w:type="spellEnd"/>
-      <w:r>
-        <w:rPr>
-          <w:rFonts w:ascii="Times New Roman" w:eastAsia="Times New Roman" w:hAnsi="Times New Roman" w:cs="Times New Roman"/>
-          <w:color w:val="000000" w:themeColor="text1"/>
-          <w:sz w:val="18"/>
-          <w:szCs w:val="18"/>
-        </w:rPr>
-        <w:t xml:space="preserve">, Hive, Impala) that flags client spending spikes and portfolio shifts to trigger targeted banker outreach, scheduled </w:t>
-      </w:r>
-      <w:r>
-        <w:rPr>
-          <w:rFonts w:ascii="Times New Roman" w:eastAsia="Times New Roman" w:hAnsi="Times New Roman" w:cs="Times New Roman"/>
-          <w:color w:val="000000" w:themeColor="text1"/>
-          <w:sz w:val="18"/>
-          <w:szCs w:val="18"/>
-        </w:rPr>
-        <w:t>through</w:t>
-      </w:r>
-      <w:r>
-        <w:rPr>
-          <w:rFonts w:ascii="Times New Roman" w:eastAsia="Times New Roman" w:hAnsi="Times New Roman" w:cs="Times New Roman"/>
-          <w:color w:val="000000" w:themeColor="text1"/>
-          <w:sz w:val="18"/>
-          <w:szCs w:val="18"/>
-        </w:rPr>
-        <w:t xml:space="preserve"> </w:t>
-      </w:r>
-      <w:proofErr w:type="spellStart"/>
-      <w:r>
-        <w:rPr>
-          <w:rFonts w:ascii="Times New Roman" w:eastAsia="Times New Roman" w:hAnsi="Times New Roman" w:cs="Times New Roman"/>
-          <w:color w:val="000000" w:themeColor="text1"/>
-          <w:sz w:val="18"/>
-          <w:szCs w:val="18"/>
-        </w:rPr>
-        <w:t>Slurm</w:t>
-      </w:r>
-      <w:proofErr w:type="spellEnd"/>
-      <w:r>
-        <w:rPr>
-          <w:rFonts w:ascii="Times New Roman" w:eastAsia="Times New Roman" w:hAnsi="Times New Roman" w:cs="Times New Roman"/>
-          <w:color w:val="000000" w:themeColor="text1"/>
-          <w:sz w:val="18"/>
-          <w:szCs w:val="18"/>
-        </w:rPr>
-        <w:t xml:space="preserve">/PowerShell automation, driving a </w:t>
+        <w:t xml:space="preserve">Engineered an end-to-end big data pipeline (Python, PySpark, Hadoop, Hive, Impala) that flags client spending spikes and portfolio shifts to trigger targeted banker outreach, scheduled through Slurm/PowerShell automation, driving a </w:t>
       </w:r>
       <w:r>
         <w:rPr>
@@ -1819,18 +1663,7 @@
           <w:szCs w:val="18"/>
         </w:rPr>
         <w:tab/>
-        <w:t xml:space="preserve">            </w:t>
-      </w:r>
-      <w:r>
-        <w:rPr>
-          <w:rFonts w:ascii="Times New Roman" w:eastAsia="Times New Roman" w:hAnsi="Times New Roman" w:cs="Times New Roman"/>
-          <w:b/>
-          <w:bCs/>
-          <w:color w:val="000000" w:themeColor="text1"/>
-          <w:sz w:val="18"/>
-          <w:szCs w:val="18"/>
-        </w:rPr>
-        <w:t xml:space="preserve"> </w:t>
+        <w:t xml:space="preserve">             </w:t>
       </w:r>
       <w:r>
         <w:rPr>
@@ -1968,24 +1801,7 @@
           <w:szCs w:val="18"/>
         </w:rPr>
         <w:tab/>
-      </w:r>
-      <w:r>
-        <w:rPr>
-          <w:rFonts w:ascii="Times New Roman" w:eastAsia="Times New Roman" w:hAnsi="Times New Roman" w:cs="Times New Roman"/>
-          <w:color w:val="000000" w:themeColor="text1"/>
-          <w:sz w:val="18"/>
-          <w:szCs w:val="18"/>
-        </w:rPr>
-        <w:t xml:space="preserve">             </w:t>
-      </w:r>
-      <w:r>
-        <w:rPr>
-          <w:rFonts w:ascii="Times New Roman" w:eastAsia="Times New Roman" w:hAnsi="Times New Roman" w:cs="Times New Roman"/>
-          <w:color w:val="000000" w:themeColor="text1"/>
-          <w:sz w:val="18"/>
-          <w:szCs w:val="18"/>
-        </w:rPr>
-        <w:t>January 2025 – January 2026</w:t>
+        <w:t xml:space="preserve">             January 2025 – January 2026</w:t>
       </w:r>
     </w:p>
     <w:p>
@@ -2096,390 +1912,6 @@
     </w:p>
     <w:p>
       <w:pPr>
-        <w:pStyle w:val="ListParagraph"/>
-        <w:pBdr>
-          <w:top w:val="nil"/>
-          <w:left w:val="nil"/>
-          <w:bottom w:val="nil"/>
-          <w:right w:val="nil"/>
-          <w:between w:val="nil"/>
-        </w:pBdr>
-        <w:spacing w:after="0" w:line="240" w:lineRule="auto"/>
-        <w:ind w:left="0"/>
-        <w:rPr>
-          <w:rFonts w:ascii="Times New Roman" w:eastAsia="Times New Roman" w:hAnsi="Times New Roman" w:cs="Times New Roman"/>
-          <w:color w:val="000000" w:themeColor="text1"/>
-          <w:sz w:val="18"/>
-          <w:szCs w:val="18"/>
-        </w:rPr>
-      </w:pPr>
-      <w:r>
-        <w:rPr>
-          <w:rFonts w:ascii="Times New Roman" w:eastAsia="Times New Roman" w:hAnsi="Times New Roman" w:cs="Times New Roman"/>
-          <w:b/>
-          <w:bCs/>
-          <w:color w:val="000000" w:themeColor="text1"/>
-          <w:sz w:val="18"/>
-          <w:szCs w:val="18"/>
-        </w:rPr>
-        <w:t>PRAG Global Inverters</w:t>
-      </w:r>
-      <w:r>
-        <w:rPr>
-          <w:rFonts w:ascii="Times New Roman" w:eastAsia="Times New Roman" w:hAnsi="Times New Roman" w:cs="Times New Roman"/>
-          <w:b/>
-          <w:bCs/>
-          <w:color w:val="000000" w:themeColor="text1"/>
-          <w:sz w:val="18"/>
-          <w:szCs w:val="18"/>
-        </w:rPr>
-        <w:tab/>
-      </w:r>
-      <w:r>
-        <w:rPr>
-          <w:rFonts w:ascii="Times New Roman" w:eastAsia="Times New Roman" w:hAnsi="Times New Roman" w:cs="Times New Roman"/>
-          <w:b/>
-          <w:bCs/>
-          <w:color w:val="000000" w:themeColor="text1"/>
-          <w:sz w:val="18"/>
-          <w:szCs w:val="18"/>
-        </w:rPr>
-        <w:tab/>
-      </w:r>
-      <w:r>
-        <w:rPr>
-          <w:rFonts w:ascii="Times New Roman" w:eastAsia="Times New Roman" w:hAnsi="Times New Roman" w:cs="Times New Roman"/>
-          <w:b/>
-          <w:bCs/>
-          <w:color w:val="000000" w:themeColor="text1"/>
-          <w:sz w:val="18"/>
-          <w:szCs w:val="18"/>
-        </w:rPr>
-        <w:tab/>
-      </w:r>
-      <w:r>
-        <w:rPr>
-          <w:rFonts w:ascii="Times New Roman" w:eastAsia="Times New Roman" w:hAnsi="Times New Roman" w:cs="Times New Roman"/>
-          <w:b/>
-          <w:bCs/>
-          <w:color w:val="000000" w:themeColor="text1"/>
-          <w:sz w:val="18"/>
-          <w:szCs w:val="18"/>
-        </w:rPr>
-        <w:tab/>
-      </w:r>
-      <w:r>
-        <w:rPr>
-          <w:rFonts w:ascii="Times New Roman" w:eastAsia="Times New Roman" w:hAnsi="Times New Roman" w:cs="Times New Roman"/>
-          <w:b/>
-          <w:bCs/>
-          <w:color w:val="000000" w:themeColor="text1"/>
-          <w:sz w:val="18"/>
-          <w:szCs w:val="18"/>
-        </w:rPr>
-        <w:tab/>
-      </w:r>
-      <w:r>
-        <w:rPr>
-          <w:rFonts w:ascii="Times New Roman" w:eastAsia="Times New Roman" w:hAnsi="Times New Roman" w:cs="Times New Roman"/>
-          <w:b/>
-          <w:bCs/>
-          <w:color w:val="000000" w:themeColor="text1"/>
-          <w:sz w:val="18"/>
-          <w:szCs w:val="18"/>
-        </w:rPr>
-        <w:tab/>
-      </w:r>
-      <w:r>
-        <w:rPr>
-          <w:rFonts w:ascii="Times New Roman" w:eastAsia="Times New Roman" w:hAnsi="Times New Roman" w:cs="Times New Roman"/>
-          <w:b/>
-          <w:bCs/>
-          <w:color w:val="000000" w:themeColor="text1"/>
-          <w:sz w:val="18"/>
-          <w:szCs w:val="18"/>
-        </w:rPr>
-        <w:tab/>
-      </w:r>
-      <w:r>
-        <w:rPr>
-          <w:rFonts w:ascii="Times New Roman" w:eastAsia="Times New Roman" w:hAnsi="Times New Roman" w:cs="Times New Roman"/>
-          <w:b/>
-          <w:bCs/>
-          <w:color w:val="000000" w:themeColor="text1"/>
-          <w:sz w:val="18"/>
-          <w:szCs w:val="18"/>
-        </w:rPr>
-        <w:tab/>
-      </w:r>
-      <w:r>
-        <w:rPr>
-          <w:rFonts w:ascii="Times New Roman" w:eastAsia="Times New Roman" w:hAnsi="Times New Roman" w:cs="Times New Roman"/>
-          <w:b/>
-          <w:bCs/>
-          <w:color w:val="000000" w:themeColor="text1"/>
-          <w:sz w:val="18"/>
-          <w:szCs w:val="18"/>
-        </w:rPr>
-        <w:tab/>
-      </w:r>
-      <w:r>
-        <w:rPr>
-          <w:rFonts w:ascii="Times New Roman" w:eastAsia="Times New Roman" w:hAnsi="Times New Roman" w:cs="Times New Roman"/>
-          <w:b/>
-          <w:bCs/>
-          <w:color w:val="000000" w:themeColor="text1"/>
-          <w:sz w:val="18"/>
-          <w:szCs w:val="18"/>
-        </w:rPr>
-        <w:tab/>
-      </w:r>
-      <w:r>
-        <w:rPr>
-          <w:rFonts w:ascii="Times New Roman" w:eastAsia="Times New Roman" w:hAnsi="Times New Roman" w:cs="Times New Roman"/>
-          <w:b/>
-          <w:bCs/>
-          <w:color w:val="000000" w:themeColor="text1"/>
-          <w:sz w:val="18"/>
-          <w:szCs w:val="18"/>
-        </w:rPr>
-        <w:tab/>
-      </w:r>
-      <w:r>
-        <w:rPr>
-          <w:rFonts w:ascii="Times New Roman" w:eastAsia="Times New Roman" w:hAnsi="Times New Roman" w:cs="Times New Roman"/>
-          <w:b/>
-          <w:bCs/>
-          <w:color w:val="000000" w:themeColor="text1"/>
-          <w:sz w:val="18"/>
-          <w:szCs w:val="18"/>
-        </w:rPr>
-        <w:tab/>
-        <w:t xml:space="preserve">  </w:t>
-      </w:r>
-      <w:r>
-        <w:rPr>
-          <w:rFonts w:ascii="Times New Roman" w:eastAsia="Times New Roman" w:hAnsi="Times New Roman" w:cs="Times New Roman"/>
-          <w:b/>
-          <w:bCs/>
-          <w:color w:val="000000" w:themeColor="text1"/>
-          <w:sz w:val="18"/>
-          <w:szCs w:val="18"/>
-        </w:rPr>
-        <w:t xml:space="preserve"> </w:t>
-      </w:r>
-      <w:r>
-        <w:rPr>
-          <w:rFonts w:ascii="Times New Roman" w:eastAsia="Times New Roman" w:hAnsi="Times New Roman" w:cs="Times New Roman"/>
-          <w:color w:val="000000" w:themeColor="text1"/>
-          <w:sz w:val="18"/>
-          <w:szCs w:val="18"/>
-        </w:rPr>
-        <w:t>Lagos, Nigeria</w:t>
-      </w:r>
-    </w:p>
-    <w:p>
-      <w:pPr>
-        <w:pStyle w:val="ListParagraph"/>
-        <w:pBdr>
-          <w:top w:val="nil"/>
-          <w:left w:val="nil"/>
-          <w:bottom w:val="nil"/>
-          <w:right w:val="nil"/>
-          <w:between w:val="nil"/>
-        </w:pBdr>
-        <w:spacing w:after="0" w:line="240" w:lineRule="auto"/>
-        <w:ind w:left="0"/>
-        <w:rPr>
-          <w:rFonts w:ascii="Times New Roman" w:eastAsia="Times New Roman" w:hAnsi="Times New Roman" w:cs="Times New Roman"/>
-          <w:color w:val="000000" w:themeColor="text1"/>
-          <w:sz w:val="18"/>
-          <w:szCs w:val="18"/>
-        </w:rPr>
-      </w:pPr>
-      <w:r>
-        <w:rPr>
-          <w:rFonts w:ascii="Times New Roman" w:eastAsia="Times New Roman" w:hAnsi="Times New Roman" w:cs="Times New Roman"/>
-          <w:color w:val="000000" w:themeColor="text1"/>
-          <w:sz w:val="18"/>
-          <w:szCs w:val="18"/>
-        </w:rPr>
-        <w:t>Intern</w:t>
-      </w:r>
-      <w:r>
-        <w:rPr>
-          <w:rFonts w:ascii="Times New Roman" w:eastAsia="Times New Roman" w:hAnsi="Times New Roman" w:cs="Times New Roman"/>
-          <w:color w:val="000000" w:themeColor="text1"/>
-          <w:sz w:val="18"/>
-          <w:szCs w:val="18"/>
-        </w:rPr>
-        <w:tab/>
-      </w:r>
-      <w:r>
-        <w:rPr>
-          <w:rFonts w:ascii="Times New Roman" w:eastAsia="Times New Roman" w:hAnsi="Times New Roman" w:cs="Times New Roman"/>
-          <w:color w:val="000000" w:themeColor="text1"/>
-          <w:sz w:val="18"/>
-          <w:szCs w:val="18"/>
-        </w:rPr>
-        <w:tab/>
-      </w:r>
-      <w:r>
-        <w:rPr>
-          <w:rFonts w:ascii="Times New Roman" w:eastAsia="Times New Roman" w:hAnsi="Times New Roman" w:cs="Times New Roman"/>
-          <w:color w:val="000000" w:themeColor="text1"/>
-          <w:sz w:val="18"/>
-          <w:szCs w:val="18"/>
-        </w:rPr>
-        <w:tab/>
-      </w:r>
-      <w:r>
-        <w:rPr>
-          <w:rFonts w:ascii="Times New Roman" w:eastAsia="Times New Roman" w:hAnsi="Times New Roman" w:cs="Times New Roman"/>
-          <w:color w:val="000000" w:themeColor="text1"/>
-          <w:sz w:val="18"/>
-          <w:szCs w:val="18"/>
-        </w:rPr>
-        <w:tab/>
-      </w:r>
-      <w:r>
-        <w:rPr>
-          <w:rFonts w:ascii="Times New Roman" w:eastAsia="Times New Roman" w:hAnsi="Times New Roman" w:cs="Times New Roman"/>
-          <w:color w:val="000000" w:themeColor="text1"/>
-          <w:sz w:val="18"/>
-          <w:szCs w:val="18"/>
-        </w:rPr>
-        <w:tab/>
-      </w:r>
-      <w:r>
-        <w:rPr>
-          <w:rFonts w:ascii="Times New Roman" w:eastAsia="Times New Roman" w:hAnsi="Times New Roman" w:cs="Times New Roman"/>
-          <w:color w:val="000000" w:themeColor="text1"/>
-          <w:sz w:val="18"/>
-          <w:szCs w:val="18"/>
-        </w:rPr>
-        <w:tab/>
-      </w:r>
-      <w:r>
-        <w:rPr>
-          <w:rFonts w:ascii="Times New Roman" w:eastAsia="Times New Roman" w:hAnsi="Times New Roman" w:cs="Times New Roman"/>
-          <w:color w:val="000000" w:themeColor="text1"/>
-          <w:sz w:val="18"/>
-          <w:szCs w:val="18"/>
-        </w:rPr>
-        <w:tab/>
-      </w:r>
-      <w:r>
-        <w:rPr>
-          <w:rFonts w:ascii="Times New Roman" w:eastAsia="Times New Roman" w:hAnsi="Times New Roman" w:cs="Times New Roman"/>
-          <w:color w:val="000000" w:themeColor="text1"/>
-          <w:sz w:val="18"/>
-          <w:szCs w:val="18"/>
-        </w:rPr>
-        <w:tab/>
-      </w:r>
-      <w:r>
-        <w:rPr>
-          <w:rFonts w:ascii="Times New Roman" w:eastAsia="Times New Roman" w:hAnsi="Times New Roman" w:cs="Times New Roman"/>
-          <w:color w:val="000000" w:themeColor="text1"/>
-          <w:sz w:val="18"/>
-          <w:szCs w:val="18"/>
-        </w:rPr>
-        <w:tab/>
-      </w:r>
-      <w:r>
-        <w:rPr>
-          <w:rFonts w:ascii="Times New Roman" w:eastAsia="Times New Roman" w:hAnsi="Times New Roman" w:cs="Times New Roman"/>
-          <w:color w:val="000000" w:themeColor="text1"/>
-          <w:sz w:val="18"/>
-          <w:szCs w:val="18"/>
-        </w:rPr>
-        <w:tab/>
-      </w:r>
-      <w:r>
-        <w:rPr>
-          <w:rFonts w:ascii="Times New Roman" w:eastAsia="Times New Roman" w:hAnsi="Times New Roman" w:cs="Times New Roman"/>
-          <w:color w:val="000000" w:themeColor="text1"/>
-          <w:sz w:val="18"/>
-          <w:szCs w:val="18"/>
-        </w:rPr>
-        <w:tab/>
-      </w:r>
-      <w:r>
-        <w:rPr>
-          <w:rFonts w:ascii="Times New Roman" w:eastAsia="Times New Roman" w:hAnsi="Times New Roman" w:cs="Times New Roman"/>
-          <w:color w:val="000000" w:themeColor="text1"/>
-          <w:sz w:val="18"/>
-          <w:szCs w:val="18"/>
-        </w:rPr>
-        <w:tab/>
-        <w:t xml:space="preserve">             </w:t>
-      </w:r>
-      <w:r>
-        <w:rPr>
-          <w:rFonts w:ascii="Times New Roman" w:eastAsia="Times New Roman" w:hAnsi="Times New Roman" w:cs="Times New Roman"/>
-          <w:color w:val="000000" w:themeColor="text1"/>
-          <w:sz w:val="18"/>
-          <w:szCs w:val="18"/>
-        </w:rPr>
-        <w:t>June 2021 – September 2021</w:t>
-      </w:r>
-    </w:p>
-    <w:p>
-      <w:pPr>
-        <w:pStyle w:val="ListParagraph"/>
-        <w:numPr>
-          <w:ilvl w:val="0"/>
-          <w:numId w:val="9"/>
-        </w:numPr>
-        <w:pBdr>
-          <w:top w:val="nil"/>
-          <w:left w:val="nil"/>
-          <w:bottom w:val="nil"/>
-          <w:right w:val="nil"/>
-          <w:between w:val="nil"/>
-        </w:pBdr>
-        <w:spacing w:after="40" w:line="240" w:lineRule="auto"/>
-        <w:ind w:left="504"/>
-        <w:rPr>
-          <w:rFonts w:ascii="Times New Roman" w:eastAsia="Times New Roman" w:hAnsi="Times New Roman" w:cs="Times New Roman"/>
-          <w:color w:val="000000" w:themeColor="text1"/>
-          <w:sz w:val="18"/>
-          <w:szCs w:val="18"/>
-        </w:rPr>
-      </w:pPr>
-      <w:r>
-        <w:rPr>
-          <w:rFonts w:ascii="Times New Roman" w:eastAsia="Times New Roman" w:hAnsi="Times New Roman" w:cs="Times New Roman"/>
-          <w:color w:val="000000" w:themeColor="text1"/>
-          <w:sz w:val="18"/>
-          <w:szCs w:val="18"/>
-        </w:rPr>
-        <w:t xml:space="preserve">Enhanced technical expertise by testing the new inverter models with solar-power batteries and stabilizers to achieve a </w:t>
-      </w:r>
-      <w:r>
-        <w:rPr>
-          <w:rFonts w:ascii="Times New Roman" w:eastAsia="Times New Roman" w:hAnsi="Times New Roman" w:cs="Times New Roman"/>
-          <w:b/>
-          <w:bCs/>
-          <w:color w:val="000000" w:themeColor="text1"/>
-          <w:sz w:val="18"/>
-          <w:szCs w:val="18"/>
-        </w:rPr>
-        <w:t>15</w:t>
-      </w:r>
-      <w:r>
-        <w:rPr>
-          <w:rFonts w:ascii="Times New Roman" w:eastAsia="Times New Roman" w:hAnsi="Times New Roman" w:cs="Times New Roman"/>
-          <w:color w:val="000000" w:themeColor="text1"/>
-          <w:sz w:val="18"/>
-          <w:szCs w:val="18"/>
-        </w:rPr>
-        <w:t>% increase in household energy performance compared to prior models.</w:t>
-      </w:r>
-    </w:p>
-    <w:p>
-      <w:pPr>
         <w:pBdr>
           <w:left w:val="nil"/>
           <w:bottom w:val="single" w:sz="12" w:space="1" w:color="auto"/>
@@ -2535,18 +1967,7 @@
           <w:sz w:val="18"/>
           <w:szCs w:val="18"/>
         </w:rPr>
-        <w:t xml:space="preserve">AI-Powered Governance &amp; Model Development News Bot | Python, </w:t>
-      </w:r>
-      <w:r>
-        <w:rPr>
-          <w:rFonts w:ascii="Times New Roman" w:eastAsia="Times New Roman" w:hAnsi="Times New Roman" w:cs="Times New Roman"/>
-          <w:b/>
-          <w:bCs/>
-          <w:color w:val="000000" w:themeColor="text1"/>
-          <w:sz w:val="18"/>
-          <w:szCs w:val="18"/>
-        </w:rPr>
-        <w:t>JavaScript, HTML, CSS, Power Automate</w:t>
+        <w:t>AI-Powered Governance &amp; Model Development News Bot | Python, JavaScript, HTML, CSS, Power Automate</w:t>
       </w:r>
       <w:r>
         <w:rPr>
@@ -2649,21 +2070,7 @@
           <w:sz w:val="18"/>
           <w:szCs w:val="18"/>
         </w:rPr>
-        <w:t>Designed a chatbot interface allowing team members to query updates</w:t>
-      </w:r>
-      <w:r>
-        <w:rPr>
-          <w:sz w:val="18"/>
-          <w:szCs w:val="18"/>
-        </w:rPr>
-        <w:t xml:space="preserve"> by specific governance or regulatory events</w:t>
-      </w:r>
-      <w:r>
-        <w:rPr>
-          <w:sz w:val="18"/>
-          <w:szCs w:val="18"/>
-        </w:rPr>
-        <w:t xml:space="preserve"> on-demand, reducing manual research time and improving turnaround on time-sensitive changes.</w:t>
+        <w:t>Designed a chatbot interface allowing team members to query updates by specific governance or regulatory events on-demand, reducing manual research time and improving turnaround on time-sensitive changes.</w:t>
       </w:r>
     </w:p>
     <w:p>
@@ -2800,77 +2207,7 @@
           <w:sz w:val="18"/>
           <w:szCs w:val="18"/>
         </w:rPr>
-        <w:t>Built a</w:t>
-      </w:r>
-      <w:r>
-        <w:rPr>
-          <w:sz w:val="18"/>
-          <w:szCs w:val="18"/>
-        </w:rPr>
-        <w:t>n</w:t>
-      </w:r>
-      <w:r>
-        <w:rPr>
-          <w:sz w:val="18"/>
-          <w:szCs w:val="18"/>
-        </w:rPr>
-        <w:t xml:space="preserve"> </w:t>
-      </w:r>
-      <w:r>
-        <w:rPr>
-          <w:sz w:val="18"/>
-          <w:szCs w:val="18"/>
-        </w:rPr>
-        <w:t>automated</w:t>
-      </w:r>
-      <w:r>
-        <w:rPr>
-          <w:sz w:val="18"/>
-          <w:szCs w:val="18"/>
-        </w:rPr>
-        <w:t xml:space="preserve"> backtester </w:t>
-      </w:r>
-      <w:r>
-        <w:rPr>
-          <w:sz w:val="18"/>
-          <w:szCs w:val="18"/>
-        </w:rPr>
-        <w:t xml:space="preserve">on the Dollar Cost Average strategy </w:t>
-      </w:r>
-      <w:r>
-        <w:rPr>
-          <w:sz w:val="18"/>
-          <w:szCs w:val="18"/>
-        </w:rPr>
-        <w:t>for Nasdaq</w:t>
-      </w:r>
-      <w:r>
-        <w:rPr>
-          <w:sz w:val="18"/>
-          <w:szCs w:val="18"/>
-        </w:rPr>
-        <w:t xml:space="preserve"> </w:t>
-      </w:r>
-      <w:r>
-        <w:rPr>
-          <w:sz w:val="18"/>
-          <w:szCs w:val="18"/>
-        </w:rPr>
-        <w:t>100 futures, layering RSI, volatility, and MA200 filters to scale monthly</w:t>
-      </w:r>
-      <w:r>
-        <w:rPr>
-          <w:sz w:val="18"/>
-          <w:szCs w:val="18"/>
-        </w:rPr>
-        <w:t xml:space="preserve"> demo</w:t>
-      </w:r>
-      <w:r>
-        <w:rPr>
-          <w:sz w:val="18"/>
-          <w:szCs w:val="18"/>
-        </w:rPr>
-        <w:t xml:space="preserve"> investing, achieving an 832% return using </w:t>
+        <w:t xml:space="preserve">Built an automated backtester on the Dollar Cost Average strategy for Nasdaq 100 futures, layering RSI, volatility, and MA200 filters to scale monthly demo investing, achieving an 832% return using </w:t>
       </w:r>
       <w:r>
         <w:rPr>
@@ -3066,21 +2403,7 @@
           <w:sz w:val="18"/>
           <w:szCs w:val="18"/>
         </w:rPr>
-        <w:t xml:space="preserve">Engineered a Donchian Breakout trading algorithm in Python to </w:t>
-      </w:r>
-      <w:r>
-        <w:rPr>
-          <w:sz w:val="18"/>
-          <w:szCs w:val="18"/>
-        </w:rPr>
-        <w:t xml:space="preserve">demo </w:t>
-      </w:r>
-      <w:r>
-        <w:rPr>
-          <w:sz w:val="18"/>
-          <w:szCs w:val="18"/>
-        </w:rPr>
-        <w:t xml:space="preserve">trade BTC/USD, optimizing lookback windows across </w:t>
+        <w:t xml:space="preserve">Engineered a Donchian Breakout trading algorithm in Python to demo trade BTC/USD, optimizing lookback windows across </w:t>
       </w:r>
       <w:r>
         <w:rPr>
@@ -3096,35 +2419,7 @@
           <w:sz w:val="18"/>
           <w:szCs w:val="18"/>
         </w:rPr>
-        <w:t xml:space="preserve"> years</w:t>
-      </w:r>
-      <w:r>
-        <w:rPr>
-          <w:sz w:val="18"/>
-          <w:szCs w:val="18"/>
-        </w:rPr>
-        <w:t xml:space="preserve"> (2020-2026)</w:t>
-      </w:r>
-      <w:r>
-        <w:rPr>
-          <w:sz w:val="18"/>
-          <w:szCs w:val="18"/>
-        </w:rPr>
-        <w:t xml:space="preserve"> of price data to generate systematic long</w:t>
-      </w:r>
-      <w:r>
-        <w:rPr>
-          <w:sz w:val="18"/>
-          <w:szCs w:val="18"/>
-        </w:rPr>
-        <w:t xml:space="preserve"> or </w:t>
-      </w:r>
-      <w:r>
-        <w:rPr>
-          <w:sz w:val="18"/>
-          <w:szCs w:val="18"/>
-        </w:rPr>
-        <w:t>short signals.</w:t>
+        <w:t xml:space="preserve"> years (2020-2026) of price data to generate systematic long or short signals.</w:t>
       </w:r>
     </w:p>
     <w:p>
@@ -3146,49 +2441,7 @@
           <w:sz w:val="18"/>
           <w:szCs w:val="18"/>
         </w:rPr>
-        <w:t>Backtested the strategy on $10,000 of starting capital, generating a 742% total return while cutting max drawdown by 40% compared to buy</w:t>
-      </w:r>
-      <w:r>
-        <w:rPr>
-          <w:sz w:val="18"/>
-          <w:szCs w:val="18"/>
-        </w:rPr>
-        <w:t xml:space="preserve"> </w:t>
-      </w:r>
-      <w:r>
-        <w:rPr>
-          <w:sz w:val="18"/>
-          <w:szCs w:val="18"/>
-        </w:rPr>
-        <w:t>and</w:t>
-      </w:r>
-      <w:r>
-        <w:rPr>
-          <w:sz w:val="18"/>
-          <w:szCs w:val="18"/>
-        </w:rPr>
-        <w:t xml:space="preserve"> </w:t>
-      </w:r>
-      <w:r>
-        <w:rPr>
-          <w:sz w:val="18"/>
-          <w:szCs w:val="18"/>
-        </w:rPr>
-        <w:t xml:space="preserve">hold through the 2022 crypto </w:t>
-      </w:r>
-      <w:r>
-        <w:rPr>
-          <w:sz w:val="18"/>
-          <w:szCs w:val="18"/>
-        </w:rPr>
-        <w:t xml:space="preserve">market </w:t>
-      </w:r>
-      <w:r>
-        <w:rPr>
-          <w:sz w:val="18"/>
-          <w:szCs w:val="18"/>
-        </w:rPr>
-        <w:t>downturn.</w:t>
+        <w:t>Backtested the strategy on $10,000 of starting capital, generating a 742% total return while cutting max drawdown by 40% compared to buy and hold through the 2022 crypto market downturn.</w:t>
       </w:r>
     </w:p>
     <w:p>
@@ -3296,18 +2549,7 @@
           <w:szCs w:val="18"/>
         </w:rPr>
         <w:tab/>
-        <w:t xml:space="preserve">    </w:t>
-      </w:r>
-      <w:r>
-        <w:rPr>
-          <w:rFonts w:ascii="Times New Roman" w:eastAsia="Times New Roman" w:hAnsi="Times New Roman" w:cs="Times New Roman"/>
-          <w:b/>
-          <w:bCs/>
-          <w:color w:val="000000" w:themeColor="text1"/>
-          <w:sz w:val="18"/>
-          <w:szCs w:val="18"/>
-        </w:rPr>
-        <w:t xml:space="preserve">  </w:t>
+        <w:t xml:space="preserve">      </w:t>
       </w:r>
       <w:r>
         <w:rPr>
@@ -3698,34 +2940,6 @@
           <w:szCs w:val="18"/>
         </w:rPr>
         <w:tab/>
-        <w:t xml:space="preserve">       </w:t>
-      </w:r>
-      <w:r>
-        <w:rPr>
-          <w:rFonts w:ascii="Times New Roman" w:eastAsia="Times New Roman" w:hAnsi="Times New Roman" w:cs="Times New Roman"/>
-          <w:color w:val="000000" w:themeColor="text1"/>
-          <w:sz w:val="18"/>
-          <w:szCs w:val="18"/>
-        </w:rPr>
-        <w:t xml:space="preserve"> </w:t>
-      </w:r>
-      <w:r>
-        <w:rPr>
-          <w:rFonts w:ascii="Times New Roman" w:eastAsia="Times New Roman" w:hAnsi="Times New Roman" w:cs="Times New Roman"/>
-          <w:color w:val="000000" w:themeColor="text1"/>
-          <w:sz w:val="18"/>
-          <w:szCs w:val="18"/>
-        </w:rPr>
-        <w:tab/>
-      </w:r>
-      <w:r>
-        <w:rPr>
-          <w:rFonts w:ascii="Times New Roman" w:eastAsia="Times New Roman" w:hAnsi="Times New Roman" w:cs="Times New Roman"/>
-          <w:color w:val="000000" w:themeColor="text1"/>
-          <w:sz w:val="18"/>
-          <w:szCs w:val="18"/>
-        </w:rPr>
-        <w:tab/>
         <w:t xml:space="preserve">        </w:t>
       </w:r>
       <w:r>
@@ -3735,7 +2949,17 @@
           <w:sz w:val="18"/>
           <w:szCs w:val="18"/>
         </w:rPr>
-        <w:t>August 2025 – Present</w:t>
+        <w:tab/>
+      </w:r>
+      <w:r>
+        <w:rPr>
+          <w:rFonts w:ascii="Times New Roman" w:eastAsia="Times New Roman" w:hAnsi="Times New Roman" w:cs="Times New Roman"/>
+          <w:color w:val="000000" w:themeColor="text1"/>
+          <w:sz w:val="18"/>
+          <w:szCs w:val="18"/>
+        </w:rPr>
+        <w:tab/>
+        <w:t xml:space="preserve">        August 2025 – Present</w:t>
       </w:r>
     </w:p>
     <w:p>
@@ -3761,7 +2985,27 @@
           <w:sz w:val="18"/>
           <w:szCs w:val="18"/>
         </w:rPr>
-        <w:t>Executed new fundraising events and managed chapter financial planning, resulting in a 5% organizational growth for the academic year.</w:t>
+        <w:t xml:space="preserve">Executed new fundraising events and managed chapter financial planning, resulting in a </w:t>
+      </w:r>
+      <w:r>
+        <w:rPr>
+          <w:rFonts w:ascii="Times New Roman" w:eastAsia="Times New Roman" w:hAnsi="Times New Roman" w:cs="Times New Roman"/>
+          <w:b/>
+          <w:bCs/>
+          <w:color w:val="000000" w:themeColor="text1"/>
+          <w:sz w:val="18"/>
+          <w:szCs w:val="18"/>
+        </w:rPr>
+        <w:t>5</w:t>
+      </w:r>
+      <w:r>
+        <w:rPr>
+          <w:rFonts w:ascii="Times New Roman" w:eastAsia="Times New Roman" w:hAnsi="Times New Roman" w:cs="Times New Roman"/>
+          <w:color w:val="000000" w:themeColor="text1"/>
+          <w:sz w:val="18"/>
+          <w:szCs w:val="18"/>
+        </w:rPr>
+        <w:t>% organizational growth for the academic year.</w:t>
       </w:r>
     </w:p>
     <w:p>
@@ -3893,16 +3137,7 @@
           <w:szCs w:val="18"/>
         </w:rPr>
         <w:tab/>
-        <w:t xml:space="preserve">      </w:t>
-      </w:r>
-      <w:r>
-        <w:rPr>
-          <w:rFonts w:ascii="Times New Roman" w:eastAsia="Times New Roman" w:hAnsi="Times New Roman" w:cs="Times New Roman"/>
-          <w:color w:val="000000" w:themeColor="text1"/>
-          <w:sz w:val="18"/>
-          <w:szCs w:val="18"/>
-        </w:rPr>
-        <w:t>Lawrenceville, Georgia</w:t>
+        <w:t xml:space="preserve">      Lawrenceville, Georgia</w:t>
       </w:r>
     </w:p>
     <w:p>
@@ -4059,16 +3294,7 @@
           <w:sz w:val="18"/>
           <w:szCs w:val="18"/>
         </w:rPr>
-        <w:t>Contributed</w:t>
-      </w:r>
-      <w:r>
-        <w:rPr>
-          <w:rFonts w:ascii="Times New Roman" w:eastAsia="Times New Roman" w:hAnsi="Times New Roman" w:cs="Times New Roman"/>
-          <w:color w:val="000000" w:themeColor="text1"/>
-          <w:sz w:val="18"/>
-          <w:szCs w:val="18"/>
-        </w:rPr>
-        <w:t xml:space="preserve"> over </w:t>
+        <w:t xml:space="preserve">Contributed over </w:t>
       </w:r>
       <w:r>
         <w:rPr>
@@ -4390,16 +3616,7 @@
           <w:szCs w:val="18"/>
         </w:rPr>
         <w:tab/>
-        <w:t xml:space="preserve">          </w:t>
-      </w:r>
-      <w:r>
-        <w:rPr>
-          <w:rFonts w:ascii="Times New Roman" w:eastAsia="Times New Roman" w:hAnsi="Times New Roman" w:cs="Times New Roman"/>
-          <w:color w:val="000000" w:themeColor="text1"/>
-          <w:sz w:val="18"/>
-          <w:szCs w:val="18"/>
-        </w:rPr>
-        <w:t xml:space="preserve">March 2022 – September 2024 </w:t>
+        <w:t xml:space="preserve">          March 2022 – September 2024 </w:t>
       </w:r>
     </w:p>
     <w:p>
@@ -4521,7 +3738,7 @@
     <w:sectPr>
       <w:headerReference w:type="default" r:id="rId7"/>
       <w:pgSz w:w="12240" w:h="15840"/>
-      <w:pgMar w:top="432" w:right="432" w:bottom="432" w:left="432" w:header="432" w:footer="0" w:gutter="0"/>
+      <w:pgMar w:top="216" w:right="432" w:bottom="216" w:left="432" w:header="432" w:footer="0" w:gutter="0"/>
       <w:cols w:space="720"/>
       <w:docGrid w:linePitch="360"/>
     </w:sectPr>
@@ -4694,8 +3911,60 @@
         <w:sz w:val="21"/>
         <w:szCs w:val="21"/>
       </w:rPr>
-      <w:t xml:space="preserve"> | 678 740-1674</w:t>
+      <w:t xml:space="preserve"> | 678 740-1674 | </w:t>
     </w:r>
+    <w:bookmarkStart w:id="1" w:name="_Hlk239005088"/>
+    <w:r>
+      <w:rPr>
+        <w:rFonts w:ascii="Times New Roman" w:eastAsia="Times New Roman" w:hAnsi="Times New Roman" w:cs="Times New Roman"/>
+        <w:sz w:val="21"/>
+        <w:szCs w:val="21"/>
+      </w:rPr>
+      <w:fldChar w:fldCharType="begin"/>
+    </w:r>
+    <w:r>
+      <w:rPr>
+        <w:rFonts w:ascii="Times New Roman" w:eastAsia="Times New Roman" w:hAnsi="Times New Roman" w:cs="Times New Roman"/>
+        <w:sz w:val="21"/>
+        <w:szCs w:val="21"/>
+      </w:rPr>
+      <w:instrText>HYPERLINK "https://joshuaebinisi.vercel.app/"</w:instrText>
+    </w:r>
+    <w:r>
+      <w:rPr>
+        <w:rFonts w:ascii="Times New Roman" w:eastAsia="Times New Roman" w:hAnsi="Times New Roman" w:cs="Times New Roman"/>
+        <w:sz w:val="21"/>
+        <w:szCs w:val="21"/>
+      </w:rPr>
+    </w:r>
+    <w:r>
+      <w:rPr>
+        <w:rFonts w:ascii="Times New Roman" w:eastAsia="Times New Roman" w:hAnsi="Times New Roman" w:cs="Times New Roman"/>
+        <w:sz w:val="21"/>
+        <w:szCs w:val="21"/>
+      </w:rPr>
+      <w:fldChar w:fldCharType="separate"/>
+    </w:r>
+    <w:r>
+      <w:rPr>
+        <w:rStyle w:val="Hyperlink"/>
+        <w:rFonts w:ascii="Times New Roman" w:eastAsia="Times New Roman" w:hAnsi="Times New Roman" w:cs="Times New Roman"/>
+        <w:color w:val="auto"/>
+        <w:sz w:val="21"/>
+        <w:szCs w:val="21"/>
+        <w:u w:val="none"/>
+      </w:rPr>
+      <w:t>joshuaebinisi.vercel.app</w:t>
+    </w:r>
+    <w:r>
+      <w:rPr>
+        <w:rFonts w:ascii="Times New Roman" w:eastAsia="Times New Roman" w:hAnsi="Times New Roman" w:cs="Times New Roman"/>
+        <w:sz w:val="21"/>
+        <w:szCs w:val="21"/>
+      </w:rPr>
+      <w:fldChar w:fldCharType="end"/>
+    </w:r>
+    <w:bookmarkEnd w:id="1"/>
   </w:p>
 </w:hdr>
 </file>
@@ -5835,12 +5104,12 @@
   <w:abstractNum w:abstractNumId="10" w15:restartNumberingAfterBreak="0">
     <w:nsid w:val="4FB92034"/>
     <w:multiLevelType w:val="hybridMultilevel"/>
-    <w:tmpl w:val="D138E16C"/>
-    <w:lvl w:ilvl="0" w:tplc="D9B6A56C">
-      <w:start w:val="1"/>
-      <w:numFmt w:val="bullet"/>
-      <w:lvlText w:val=""/>
-      <w:lvlJc w:val="right"/>
+    <w:tmpl w:val="13F890F4"/>
+    <w:lvl w:ilvl="0" w:tplc="04090005">
+      <w:start w:val="1"/>
+      <w:numFmt w:val="bullet"/>
+      <w:lvlText w:val=""/>
+      <w:lvlJc w:val="left"/>
       <w:pPr>
         <w:ind w:left="720" w:hanging="360"/>
       </w:pPr>
@@ -6061,12 +5330,12 @@
   <w:abstractNum w:abstractNumId="12" w15:restartNumberingAfterBreak="0">
     <w:nsid w:val="539251C2"/>
     <w:multiLevelType w:val="hybridMultilevel"/>
-    <w:tmpl w:val="6C4C41DE"/>
-    <w:lvl w:ilvl="0" w:tplc="D9B6A56C">
-      <w:start w:val="1"/>
-      <w:numFmt w:val="bullet"/>
-      <w:lvlText w:val=""/>
-      <w:lvlJc w:val="right"/>
+    <w:tmpl w:val="0D48EDFC"/>
+    <w:lvl w:ilvl="0" w:tplc="04090005">
+      <w:start w:val="1"/>
+      <w:numFmt w:val="bullet"/>
+      <w:lvlText w:val=""/>
+      <w:lvlJc w:val="left"/>
       <w:pPr>
         <w:ind w:left="1440" w:hanging="360"/>
       </w:pPr>
@@ -6287,12 +5556,12 @@
   <w:abstractNum w:abstractNumId="14" w15:restartNumberingAfterBreak="0">
     <w:nsid w:val="5ACD2494"/>
     <w:multiLevelType w:val="hybridMultilevel"/>
-    <w:tmpl w:val="90847E5A"/>
-    <w:lvl w:ilvl="0" w:tplc="D9B6A56C">
-      <w:start w:val="1"/>
-      <w:numFmt w:val="bullet"/>
-      <w:lvlText w:val=""/>
-      <w:lvlJc w:val="right"/>
+    <w:tmpl w:val="85324FF2"/>
+    <w:lvl w:ilvl="0" w:tplc="04090005">
+      <w:start w:val="1"/>
+      <w:numFmt w:val="bullet"/>
+      <w:lvlText w:val=""/>
+      <w:lvlJc w:val="left"/>
       <w:pPr>
         <w:ind w:left="1440" w:hanging="360"/>
       </w:pPr>
@@ -6739,12 +6008,12 @@
   <w:abstractNum w:abstractNumId="18" w15:restartNumberingAfterBreak="0">
     <w:nsid w:val="67AF5F96"/>
     <w:multiLevelType w:val="hybridMultilevel"/>
-    <w:tmpl w:val="986843D8"/>
-    <w:lvl w:ilvl="0" w:tplc="D9B6A56C">
-      <w:start w:val="1"/>
-      <w:numFmt w:val="bullet"/>
-      <w:lvlText w:val=""/>
-      <w:lvlJc w:val="right"/>
+    <w:tmpl w:val="1F90196E"/>
+    <w:lvl w:ilvl="0" w:tplc="04090005">
+      <w:start w:val="1"/>
+      <w:numFmt w:val="bullet"/>
+      <w:lvlText w:val=""/>
+      <w:lvlJc w:val="left"/>
       <w:pPr>
         <w:ind w:left="720" w:hanging="360"/>
       </w:pPr>
@@ -6967,12 +6236,12 @@
   <w:abstractNum w:abstractNumId="20" w15:restartNumberingAfterBreak="0">
     <w:nsid w:val="6E6A367C"/>
     <w:multiLevelType w:val="hybridMultilevel"/>
-    <w:tmpl w:val="DC46F844"/>
-    <w:lvl w:ilvl="0" w:tplc="D9B6A56C">
-      <w:start w:val="1"/>
-      <w:numFmt w:val="bullet"/>
-      <w:lvlText w:val=""/>
-      <w:lvlJc w:val="right"/>
+    <w:tmpl w:val="BBBE17A6"/>
+    <w:lvl w:ilvl="0" w:tplc="04090005">
+      <w:start w:val="1"/>
+      <w:numFmt w:val="bullet"/>
+      <w:lvlText w:val=""/>
+      <w:lvlJc w:val="left"/>
       <w:pPr>
         <w:ind w:left="720" w:hanging="360"/>
       </w:pPr>
@@ -7080,12 +6349,12 @@
   <w:abstractNum w:abstractNumId="21" w15:restartNumberingAfterBreak="0">
     <w:nsid w:val="75AB745D"/>
     <w:multiLevelType w:val="hybridMultilevel"/>
-    <w:tmpl w:val="EF94C4F2"/>
-    <w:lvl w:ilvl="0" w:tplc="D9B6A56C">
-      <w:start w:val="1"/>
-      <w:numFmt w:val="bullet"/>
-      <w:lvlText w:val=""/>
-      <w:lvlJc w:val="right"/>
+    <w:tmpl w:val="29F4D4B6"/>
+    <w:lvl w:ilvl="0" w:tplc="04090005">
+      <w:start w:val="1"/>
+      <w:numFmt w:val="bullet"/>
+      <w:lvlText w:val=""/>
+      <w:lvlJc w:val="left"/>
       <w:pPr>
         <w:ind w:left="720" w:hanging="360"/>
       </w:pPr>
@@ -7193,12 +6462,12 @@
   <w:abstractNum w:abstractNumId="22" w15:restartNumberingAfterBreak="0">
     <w:nsid w:val="7611398B"/>
     <w:multiLevelType w:val="hybridMultilevel"/>
-    <w:tmpl w:val="E3B8B0C2"/>
-    <w:lvl w:ilvl="0" w:tplc="D9B6A56C">
-      <w:start w:val="1"/>
-      <w:numFmt w:val="bullet"/>
-      <w:lvlText w:val=""/>
-      <w:lvlJc w:val="right"/>
+    <w:tmpl w:val="A2F2B7A2"/>
+    <w:lvl w:ilvl="0" w:tplc="04090005">
+      <w:start w:val="1"/>
+      <w:numFmt w:val="bullet"/>
+      <w:lvlText w:val=""/>
+      <w:lvlJc w:val="left"/>
       <w:pPr>
         <w:ind w:left="720" w:hanging="360"/>
       </w:pPr>

</xml_diff>

<commit_message>
update: simplify hackathon bullet on resume
Co-Authored-By: Claude Opus 5.5 <noreply@anthropic.com>
</commit_message>
<xml_diff>
--- a/Joshua Ebinisi Resume.docx
+++ b/Joshua Ebinisi Resume.docx
@@ -921,27 +921,7 @@
           <w:sz w:val="18"/>
           <w:szCs w:val="18"/>
         </w:rPr>
-        <w:t xml:space="preserve">Selected as 1 of </w:t>
-      </w:r>
-      <w:r>
-        <w:rPr>
-          <w:rFonts w:ascii="Times New Roman" w:eastAsia="Times New Roman" w:hAnsi="Times New Roman" w:cs="Times New Roman"/>
-          <w:b/>
-          <w:bCs/>
-          <w:color w:val="000000" w:themeColor="text1"/>
-          <w:sz w:val="18"/>
-          <w:szCs w:val="18"/>
-        </w:rPr>
-        <w:t xml:space="preserve">50</w:t>
-      </w:r>
-      <w:r>
-        <w:rPr>
-          <w:rFonts w:ascii="Times New Roman" w:eastAsia="Times New Roman" w:hAnsi="Times New Roman" w:cs="Times New Roman"/>
-          <w:color w:val="000000" w:themeColor="text1"/>
-          <w:sz w:val="18"/>
-          <w:szCs w:val="18"/>
-        </w:rPr>
-        <w:t xml:space="preserve"> participants to partner with the NBPA, modeling </w:t>
+        <w:t xml:space="preserve">Researched how NBA travel and scheduling affect team performance across </w:t>
       </w:r>
       <w:r>
         <w:rPr>
@@ -961,47 +941,47 @@
           <w:sz w:val="18"/>
           <w:szCs w:val="18"/>
         </w:rPr>
-        <w:t xml:space="preserve"> NBA games in Python (statsmodels) to show back-to-backs cost </w:t>
-      </w:r>
-      <w:r>
-        <w:rPr>
-          <w:rFonts w:ascii="Times New Roman" w:eastAsia="Times New Roman" w:hAnsi="Times New Roman" w:cs="Times New Roman"/>
-          <w:b/>
-          <w:bCs/>
-          <w:color w:val="000000" w:themeColor="text1"/>
-          <w:sz w:val="18"/>
-          <w:szCs w:val="18"/>
-        </w:rPr>
-        <w:t xml:space="preserve">2.4</w:t>
-      </w:r>
-      <w:r>
-        <w:rPr>
-          <w:rFonts w:ascii="Times New Roman" w:eastAsia="Times New Roman" w:hAnsi="Times New Roman" w:cs="Times New Roman"/>
-          <w:color w:val="000000" w:themeColor="text1"/>
-          <w:sz w:val="18"/>
-          <w:szCs w:val="18"/>
-        </w:rPr>
-        <w:t xml:space="preserve"> points of Net Rating per 100 possessions, and designed a dashboard with a schedule optimizer cutting back-to-backs by </w:t>
-      </w:r>
-      <w:r>
-        <w:rPr>
-          <w:rFonts w:ascii="Times New Roman" w:eastAsia="Times New Roman" w:hAnsi="Times New Roman" w:cs="Times New Roman"/>
-          <w:b/>
-          <w:bCs/>
-          <w:color w:val="000000" w:themeColor="text1"/>
-          <w:sz w:val="18"/>
-          <w:szCs w:val="18"/>
-        </w:rPr>
-        <w:t xml:space="preserve">50</w:t>
-      </w:r>
-      <w:r>
-        <w:rPr>
-          <w:rFonts w:ascii="Times New Roman" w:eastAsia="Times New Roman" w:hAnsi="Times New Roman" w:cs="Times New Roman"/>
-          <w:color w:val="000000" w:themeColor="text1"/>
-          <w:sz w:val="18"/>
-          <w:szCs w:val="18"/>
-        </w:rPr>
-        <w:t xml:space="preserve">%.</w:t>
+        <w:t xml:space="preserve"> games, finding back-to-backs had the most significant effect, dropping teams to a </w:t>
+      </w:r>
+      <w:r>
+        <w:rPr>
+          <w:rFonts w:ascii="Times New Roman" w:eastAsia="Times New Roman" w:hAnsi="Times New Roman" w:cs="Times New Roman"/>
+          <w:b/>
+          <w:bCs/>
+          <w:color w:val="000000" w:themeColor="text1"/>
+          <w:sz w:val="18"/>
+          <w:szCs w:val="18"/>
+        </w:rPr>
+        <w:t xml:space="preserve">44%</w:t>
+      </w:r>
+      <w:r>
+        <w:rPr>
+          <w:rFonts w:ascii="Times New Roman" w:eastAsia="Times New Roman" w:hAnsi="Times New Roman" w:cs="Times New Roman"/>
+          <w:color w:val="000000" w:themeColor="text1"/>
+          <w:sz w:val="18"/>
+          <w:szCs w:val="18"/>
+        </w:rPr>
+        <w:t xml:space="preserve"> win rate; collaborated in a diverse </w:t>
+      </w:r>
+      <w:r>
+        <w:rPr>
+          <w:rFonts w:ascii="Times New Roman" w:eastAsia="Times New Roman" w:hAnsi="Times New Roman" w:cs="Times New Roman"/>
+          <w:b/>
+          <w:bCs/>
+          <w:color w:val="000000" w:themeColor="text1"/>
+          <w:sz w:val="18"/>
+          <w:szCs w:val="18"/>
+        </w:rPr>
+        <w:t xml:space="preserve">4</w:t>
+      </w:r>
+      <w:r>
+        <w:rPr>
+          <w:rFonts w:ascii="Times New Roman" w:eastAsia="Times New Roman" w:hAnsi="Times New Roman" w:cs="Times New Roman"/>
+          <w:color w:val="000000" w:themeColor="text1"/>
+          <w:sz w:val="18"/>
+          <w:szCs w:val="18"/>
+        </w:rPr>
+        <w:t xml:space="preserve">-person team using Python, Jupyter Notebooks, Pandas, and statsmodels.</w:t>
       </w:r>
     </w:p>
     <w:p>

</xml_diff>

<commit_message>
update: resume from the Quant folder, hackathon presentation as a PDF
Co-Authored-By: Claude Opus 5.5 <noreply@anthropic.com>
</commit_message>
<xml_diff>
--- a/Joshua Ebinisi Resume.docx
+++ b/Joshua Ebinisi Resume.docx
@@ -921,7 +921,7 @@
           <w:sz w:val="18"/>
           <w:szCs w:val="18"/>
         </w:rPr>
-        <w:t xml:space="preserve">Researched how NBA travel and scheduling affect team performance across </w:t>
+        <w:t xml:space="preserve">Engineered a statistical model of how NBA travel and scheduling affect team performance across </w:t>
       </w:r>
       <w:r>
         <w:rPr>
@@ -941,7 +941,7 @@
           <w:sz w:val="18"/>
           <w:szCs w:val="18"/>
         </w:rPr>
-        <w:t xml:space="preserve"> games, finding back-to-backs had the most significant effect, dropping teams to a </w:t>
+        <w:t xml:space="preserve"> games, finding back-to-backs had the largest effect, dropping teams to a </w:t>
       </w:r>
       <w:r>
         <w:rPr>

</xml_diff>

<commit_message>
update: resume header link to joshuaebinisi.com
Co-Authored-By: Claude Sonnet 5.5 <noreply@anthropic.com>
</commit_message>
<xml_diff>
--- a/Joshua Ebinisi Resume.docx
+++ b/Joshua Ebinisi Resume.docx
@@ -3908,7 +3908,7 @@
         <w:sz w:val="21"/>
         <w:szCs w:val="21"/>
       </w:rPr>
-      <w:instrText>HYPERLINK "https://joshuaebinisi.vercel.app/"</w:instrText>
+      <w:instrText>HYPERLINK "https://joshuaebinisi.com/"</w:instrText>
     </w:r>
     <w:r>
       <w:rPr>
@@ -3934,7 +3934,7 @@
         <w:szCs w:val="21"/>
         <w:u w:val="none"/>
       </w:rPr>
-      <w:t>joshuaebinisi.vercel.app</w:t>
+      <w:t>joshuaebinisi.com</w:t>
     </w:r>
     <w:r>
       <w:rPr>

</xml_diff>

<commit_message>
update: thinner section divider lines on resume
Co-Authored-By: Claude Sonnet 5.5 <noreply@anthropic.com>
</commit_message>
<xml_diff>
--- a/Joshua Ebinisi Resume.docx
+++ b/Joshua Ebinisi Resume.docx
@@ -5,7 +5,7 @@
     <w:p>
       <w:pPr>
         <w:pBdr>
-          <w:bottom w:val="single" w:sz="12" w:space="1" w:color="auto"/>
+          <w:bottom w:val="single" w:sz="4" w:space="1" w:color="auto"/>
         </w:pBdr>
         <w:spacing w:before="40" w:after="0" w:line="240" w:lineRule="auto"/>
         <w:rPr>
@@ -454,7 +454,7 @@
     <w:p>
       <w:pPr>
         <w:pBdr>
-          <w:bottom w:val="single" w:sz="12" w:space="1" w:color="auto"/>
+          <w:bottom w:val="single" w:sz="4" w:space="1" w:color="auto"/>
         </w:pBdr>
         <w:spacing w:after="0" w:line="240" w:lineRule="auto"/>
         <w:rPr>
@@ -582,7 +582,7 @@
     <w:p>
       <w:pPr>
         <w:pBdr>
-          <w:bottom w:val="single" w:sz="12" w:space="1" w:color="auto"/>
+          <w:bottom w:val="single" w:sz="4" w:space="1" w:color="auto"/>
         </w:pBdr>
         <w:spacing w:after="0" w:line="240" w:lineRule="auto"/>
         <w:rPr>
@@ -1894,7 +1894,7 @@
       <w:pPr>
         <w:pBdr>
           <w:left w:val="nil"/>
-          <w:bottom w:val="single" w:sz="12" w:space="1" w:color="auto"/>
+          <w:bottom w:val="single" w:sz="4" w:space="1" w:color="auto"/>
           <w:right w:val="nil"/>
           <w:between w:val="nil"/>
         </w:pBdr>
@@ -2648,7 +2648,7 @@
     <w:p>
       <w:pPr>
         <w:pBdr>
-          <w:bottom w:val="single" w:sz="12" w:space="1" w:color="auto"/>
+          <w:bottom w:val="single" w:sz="4" w:space="1" w:color="auto"/>
         </w:pBdr>
         <w:spacing w:after="0" w:line="240" w:lineRule="auto"/>
         <w:rPr>

</xml_diff>